<commit_message>
feat: templates Sol y Luna actualizados con marcadores v2
</commit_message>
<xml_diff>
--- a/app/templates/sol_luna/AMARILLO.docx
+++ b/app/templates/sol_luna/AMARILLO.docx
@@ -7,7 +7,7 @@
         <w:autoSpaceDE w:val="0"/>
         <w:autoSpaceDN w:val="0"/>
         <w:adjustRightInd w:val="0"/>
-        <w:spacing w:line="336" w:lineRule="auto"/>
+        <w:spacing w:line="324" w:lineRule="auto"/>
         <w:jc w:val="center"/>
         <w:rPr>
           <w:rFonts w:asciiTheme="minorBidi" w:hAnsiTheme="minorBidi" w:cstheme="minorBidi"/>
@@ -33,7 +33,7 @@
         <w:autoSpaceDE w:val="0"/>
         <w:autoSpaceDN w:val="0"/>
         <w:adjustRightInd w:val="0"/>
-        <w:spacing w:line="336" w:lineRule="auto"/>
+        <w:spacing w:line="324" w:lineRule="auto"/>
         <w:jc w:val="center"/>
         <w:rPr>
           <w:rFonts w:asciiTheme="minorBidi" w:hAnsiTheme="minorBidi" w:cstheme="minorBidi"/>
@@ -44,7 +44,7 @@
     </w:p>
     <w:p>
       <w:pPr>
-        <w:spacing w:line="336" w:lineRule="auto"/>
+        <w:spacing w:line="324" w:lineRule="auto"/>
         <w:jc w:val="both"/>
         <w:rPr>
           <w:rFonts w:asciiTheme="minorBidi" w:hAnsiTheme="minorBidi" w:cstheme="minorBidi"/>
@@ -72,7 +72,7 @@
     </w:p>
     <w:p>
       <w:pPr>
-        <w:spacing w:line="336" w:lineRule="auto"/>
+        <w:spacing w:line="324" w:lineRule="auto"/>
         <w:jc w:val="both"/>
         <w:rPr>
           <w:rFonts w:ascii="Arial" w:hAnsi="Arial" w:cs="Arial"/>
@@ -317,7 +317,7 @@
           <w:sz w:val="18"/>
           <w:szCs w:val="18"/>
         </w:rPr>
-        <w:t xml:space="preserve">, QUIEN ME MANIFESTO SER DE NACIONALIDAD: PERUANA; «_IDENT» CON DOCUMENTO NACIONAL DE IDENTIDAD NUMERO: </w:t>
+        <w:t xml:space="preserve">, QUIEN ME MANIFESTO SER DE NACIONALIDAD: PERUANA; «IDENT» CON DOCUMENTO NACIONAL DE IDENTIDAD NUMERO: </w:t>
       </w:r>
       <w:r>
         <w:rPr>
@@ -326,7 +326,7 @@
           <w:szCs w:val="18"/>
           <w:lang w:val="es-ES_tradnl"/>
         </w:rPr>
-        <w:t>«_DNI»</w:t>
+        <w:t>«DNI»</w:t>
       </w:r>
       <w:r>
         <w:rPr>
@@ -336,7 +336,7 @@
           <w:sz w:val="18"/>
           <w:szCs w:val="18"/>
         </w:rPr>
-        <w:t>; DE ESTADO CIVIL: «_ESTADO_CIVIL»; DE PROFESION U OCUPACION: «OCUPACION1»; CON DOMICILIO EN «DIRECCION1»</w:t>
+        <w:t>; DE ESTADO CIVIL: «ESTADO_CIVIL»; DE PROFESION U OCUPACION: «OCUPACION»; CON DOMICILIO EN «DIRECCION»</w:t>
       </w:r>
       <w:r>
         <w:rPr>
@@ -354,1003 +354,35 @@
           <w:sz w:val="18"/>
           <w:szCs w:val="18"/>
         </w:rPr>
-        <w:t>«_PROMT»</w:t>
+        <w:t>«</w:t>
       </w:r>
       <w:r>
         <w:rPr>
           <w:rFonts w:ascii="Arial" w:hAnsi="Arial" w:cs="Arial"/>
+          <w:b/>
+          <w:bCs/>
+          <w:sz w:val="18"/>
+          <w:szCs w:val="18"/>
+        </w:rPr>
+        <w:t>COMPRADOR</w:t>
+      </w:r>
+      <w:r>
+        <w:rPr>
+          <w:rFonts w:ascii="Arial" w:hAnsi="Arial" w:cs="Arial"/>
+          <w:b/>
+          <w:bCs/>
+          <w:sz w:val="18"/>
+          <w:szCs w:val="18"/>
+        </w:rPr>
+        <w:t>»</w:t>
+      </w:r>
+      <w:r>
+        <w:rPr>
+          <w:rFonts w:ascii="Arial" w:hAnsi="Arial" w:cs="Arial"/>
           <w:sz w:val="18"/>
           <w:szCs w:val="18"/>
         </w:rPr>
         <w:t xml:space="preserve">; EN LOS TÉRMINOS Y CONDICIONES SIGUIENTES: </w:t>
-      </w:r>
-    </w:p>
-    <w:p>
-      <w:pPr>
-        <w:pStyle w:val="NormalWeb"/>
-        <w:spacing w:before="0" w:beforeAutospacing="0" w:after="0" w:afterAutospacing="0" w:line="336" w:lineRule="auto"/>
-        <w:jc w:val="both"/>
-        <w:rPr>
-          <w:rFonts w:asciiTheme="minorBidi" w:hAnsiTheme="minorBidi" w:cstheme="minorBidi"/>
-          <w:sz w:val="18"/>
-          <w:szCs w:val="18"/>
-        </w:rPr>
-      </w:pPr>
-      <w:proofErr w:type="gramStart"/>
-      <w:r>
-        <w:rPr>
-          <w:rFonts w:asciiTheme="minorBidi" w:hAnsiTheme="minorBidi" w:cstheme="minorBidi"/>
-          <w:b/>
-          <w:sz w:val="18"/>
-          <w:szCs w:val="18"/>
-          <w:u w:val="single"/>
-        </w:rPr>
-        <w:t>PRIMERA.-</w:t>
-      </w:r>
-      <w:proofErr w:type="gramEnd"/>
-      <w:r>
-        <w:rPr>
-          <w:rFonts w:asciiTheme="minorBidi" w:hAnsiTheme="minorBidi" w:cstheme="minorBidi"/>
-          <w:b/>
-          <w:sz w:val="18"/>
-          <w:szCs w:val="18"/>
-          <w:u w:val="single"/>
-        </w:rPr>
-        <w:t xml:space="preserve"> ANTECEDENTES </w:t>
-      </w:r>
-    </w:p>
-    <w:p>
-      <w:pPr>
-        <w:pStyle w:val="NormalWeb"/>
-        <w:spacing w:before="0" w:beforeAutospacing="0" w:after="0" w:afterAutospacing="0" w:line="336" w:lineRule="auto"/>
-        <w:jc w:val="both"/>
-        <w:rPr>
-          <w:rFonts w:asciiTheme="minorBidi" w:hAnsiTheme="minorBidi" w:cstheme="minorBidi"/>
-          <w:sz w:val="18"/>
-          <w:szCs w:val="18"/>
-        </w:rPr>
-      </w:pPr>
-      <w:r>
-        <w:rPr>
-          <w:rFonts w:asciiTheme="minorBidi" w:hAnsiTheme="minorBidi" w:cstheme="minorBidi"/>
-          <w:b/>
-          <w:sz w:val="18"/>
-          <w:szCs w:val="18"/>
-        </w:rPr>
-        <w:t>EL VENDEDOR</w:t>
-      </w:r>
-      <w:r>
-        <w:rPr>
-          <w:rFonts w:asciiTheme="minorBidi" w:hAnsiTheme="minorBidi" w:cstheme="minorBidi"/>
-          <w:sz w:val="18"/>
-          <w:szCs w:val="18"/>
-        </w:rPr>
-        <w:t xml:space="preserve"> </w:t>
-      </w:r>
-      <w:r>
-        <w:rPr>
-          <w:rFonts w:asciiTheme="minorBidi" w:hAnsiTheme="minorBidi" w:cstheme="minorBidi"/>
-          <w:sz w:val="18"/>
-          <w:szCs w:val="18"/>
-        </w:rPr>
-        <w:t>DECLARA SER PROPIETARIO DEL</w:t>
-      </w:r>
-      <w:r>
-        <w:rPr>
-          <w:rFonts w:asciiTheme="minorBidi" w:eastAsia="Calibri" w:hAnsiTheme="minorBidi" w:cstheme="minorBidi"/>
-          <w:sz w:val="18"/>
-          <w:szCs w:val="18"/>
-          <w:lang w:val="es-PE" w:eastAsia="en-US"/>
-        </w:rPr>
-        <w:t xml:space="preserve"> </w:t>
-      </w:r>
-      <w:r>
-        <w:rPr>
-          <w:rFonts w:asciiTheme="minorBidi" w:hAnsiTheme="minorBidi" w:cstheme="minorBidi"/>
-          <w:b/>
-          <w:bCs/>
-          <w:caps/>
-          <w:sz w:val="18"/>
-          <w:szCs w:val="18"/>
-        </w:rPr>
-        <w:t>«DATOSLOTE»,</w:t>
-      </w:r>
-      <w:r>
-        <w:rPr>
-          <w:rFonts w:asciiTheme="minorBidi" w:hAnsiTheme="minorBidi" w:cstheme="minorBidi"/>
-          <w:b/>
-          <w:bCs/>
-          <w:caps/>
-          <w:sz w:val="18"/>
-          <w:szCs w:val="18"/>
-        </w:rPr>
-        <w:t xml:space="preserve"> DISTRITO DE PAIJAN, PROVINCIA DE ASCOPE, DEPARTAMENTO DE LA LIBERTAD</w:t>
-      </w:r>
-      <w:r>
-        <w:rPr>
-          <w:rFonts w:asciiTheme="minorBidi" w:hAnsiTheme="minorBidi" w:cstheme="minorBidi"/>
-          <w:b/>
-          <w:sz w:val="18"/>
-          <w:szCs w:val="18"/>
-        </w:rPr>
-        <w:t>,</w:t>
-      </w:r>
-      <w:r>
-        <w:rPr>
-          <w:rFonts w:asciiTheme="minorBidi" w:hAnsiTheme="minorBidi" w:cstheme="minorBidi"/>
-          <w:sz w:val="18"/>
-          <w:szCs w:val="18"/>
-        </w:rPr>
-        <w:t xml:space="preserve"> CUYO DERECHO DE PROPIEDAD, ÁREA, LINDEROS, MEDIDAS PERIMETRICAS SE ENCUENTRAN INSCRITOS EN LA </w:t>
-      </w:r>
-      <w:r>
-        <w:rPr>
-          <w:rFonts w:asciiTheme="minorBidi" w:hAnsiTheme="minorBidi" w:cstheme="minorBidi"/>
-          <w:b/>
-          <w:sz w:val="18"/>
-          <w:szCs w:val="18"/>
-        </w:rPr>
-        <w:t xml:space="preserve">PARTIDA ELECTRONICA </w:t>
-      </w:r>
-      <w:proofErr w:type="spellStart"/>
-      <w:r>
-        <w:rPr>
-          <w:rFonts w:asciiTheme="minorBidi" w:hAnsiTheme="minorBidi" w:cstheme="minorBidi"/>
-          <w:b/>
-          <w:sz w:val="18"/>
-          <w:szCs w:val="18"/>
-        </w:rPr>
-        <w:t>Nº</w:t>
-      </w:r>
-      <w:proofErr w:type="spellEnd"/>
-      <w:r>
-        <w:rPr>
-          <w:rFonts w:asciiTheme="minorBidi" w:hAnsiTheme="minorBidi" w:cstheme="minorBidi"/>
-          <w:b/>
-          <w:sz w:val="18"/>
-          <w:szCs w:val="18"/>
-        </w:rPr>
-        <w:t xml:space="preserve"> </w:t>
-      </w:r>
-      <w:r>
-        <w:rPr>
-          <w:rFonts w:asciiTheme="minorBidi" w:hAnsiTheme="minorBidi" w:cstheme="minorBidi"/>
-          <w:b/>
-          <w:sz w:val="18"/>
-          <w:szCs w:val="18"/>
-        </w:rPr>
-        <w:t>«_PR»</w:t>
-      </w:r>
-      <w:r>
-        <w:rPr>
-          <w:rFonts w:asciiTheme="minorBidi" w:hAnsiTheme="minorBidi" w:cstheme="minorBidi"/>
-          <w:sz w:val="18"/>
-          <w:szCs w:val="18"/>
-        </w:rPr>
-        <w:t>,</w:t>
-      </w:r>
-      <w:r>
-        <w:rPr>
-          <w:rFonts w:asciiTheme="minorBidi" w:hAnsiTheme="minorBidi" w:cstheme="minorBidi"/>
-          <w:b/>
-          <w:sz w:val="18"/>
-          <w:szCs w:val="18"/>
-        </w:rPr>
-        <w:t xml:space="preserve"> </w:t>
-      </w:r>
-      <w:r>
-        <w:rPr>
-          <w:rFonts w:asciiTheme="minorBidi" w:hAnsiTheme="minorBidi" w:cstheme="minorBidi"/>
-          <w:sz w:val="18"/>
-          <w:szCs w:val="18"/>
-        </w:rPr>
-        <w:t xml:space="preserve">DEL REGISTRO DE PREDIOS DE LA ZONA REGISTRAL </w:t>
-      </w:r>
-      <w:proofErr w:type="spellStart"/>
-      <w:r>
-        <w:rPr>
-          <w:rFonts w:asciiTheme="minorBidi" w:hAnsiTheme="minorBidi" w:cstheme="minorBidi"/>
-          <w:sz w:val="18"/>
-          <w:szCs w:val="18"/>
-        </w:rPr>
-        <w:t>Nº</w:t>
-      </w:r>
-      <w:proofErr w:type="spellEnd"/>
-      <w:r>
-        <w:rPr>
-          <w:rFonts w:asciiTheme="minorBidi" w:hAnsiTheme="minorBidi" w:cstheme="minorBidi"/>
-          <w:sz w:val="18"/>
-          <w:szCs w:val="18"/>
-        </w:rPr>
-        <w:t xml:space="preserve"> V – SEDE TRUJILLO, OFICINA REGISTRAL DE TRUJILLO</w:t>
-      </w:r>
-      <w:r>
-        <w:rPr>
-          <w:rFonts w:asciiTheme="minorBidi" w:hAnsiTheme="minorBidi" w:cstheme="minorBidi"/>
-          <w:bCs/>
-          <w:caps/>
-          <w:sz w:val="18"/>
-          <w:szCs w:val="18"/>
-        </w:rPr>
-        <w:t>;</w:t>
-      </w:r>
-      <w:r>
-        <w:rPr>
-          <w:rFonts w:asciiTheme="minorBidi" w:hAnsiTheme="minorBidi" w:cstheme="minorBidi"/>
-          <w:sz w:val="18"/>
-          <w:szCs w:val="18"/>
-        </w:rPr>
-        <w:t xml:space="preserve"> AL QUE EN ADELANTE SE LE DENOMINARA EL </w:t>
-      </w:r>
-      <w:r>
-        <w:rPr>
-          <w:rFonts w:asciiTheme="minorBidi" w:hAnsiTheme="minorBidi" w:cstheme="minorBidi"/>
-          <w:b/>
-          <w:bCs/>
-          <w:sz w:val="18"/>
-          <w:szCs w:val="18"/>
-        </w:rPr>
-        <w:t>PREDIO MATRIZ</w:t>
-      </w:r>
-      <w:r>
-        <w:rPr>
-          <w:rFonts w:asciiTheme="minorBidi" w:hAnsiTheme="minorBidi" w:cstheme="minorBidi"/>
-          <w:sz w:val="18"/>
-          <w:szCs w:val="18"/>
-        </w:rPr>
-        <w:t xml:space="preserve">. </w:t>
-      </w:r>
-    </w:p>
-    <w:p>
-      <w:pPr>
-        <w:pStyle w:val="NormalWeb"/>
-        <w:spacing w:before="0" w:beforeAutospacing="0" w:after="0" w:afterAutospacing="0" w:line="336" w:lineRule="auto"/>
-        <w:jc w:val="both"/>
-        <w:rPr>
-          <w:rFonts w:asciiTheme="minorBidi" w:hAnsiTheme="minorBidi" w:cstheme="minorBidi"/>
-          <w:sz w:val="18"/>
-          <w:szCs w:val="18"/>
-        </w:rPr>
-      </w:pPr>
-      <w:r>
-        <w:rPr>
-          <w:rFonts w:asciiTheme="minorBidi" w:hAnsiTheme="minorBidi" w:cstheme="minorBidi"/>
-          <w:sz w:val="18"/>
-          <w:szCs w:val="18"/>
-        </w:rPr>
-        <w:t xml:space="preserve">SOBRE EL INMUEBLE ANTES MENCIONADO </w:t>
-      </w:r>
-      <w:r>
-        <w:rPr>
-          <w:rFonts w:asciiTheme="minorBidi" w:hAnsiTheme="minorBidi" w:cstheme="minorBidi"/>
-          <w:b/>
-          <w:bCs/>
-          <w:sz w:val="18"/>
-          <w:szCs w:val="18"/>
-        </w:rPr>
-        <w:t>LA VENDEDORA</w:t>
-      </w:r>
-      <w:r>
-        <w:rPr>
-          <w:rFonts w:asciiTheme="minorBidi" w:hAnsiTheme="minorBidi" w:cstheme="minorBidi"/>
-          <w:sz w:val="18"/>
-          <w:szCs w:val="18"/>
-        </w:rPr>
-        <w:t xml:space="preserve"> HA PLANIFICADO EJECUTAR UN PROYECTO INMOBILIARIO </w:t>
-      </w:r>
-      <w:r>
-        <w:rPr>
-          <w:rFonts w:asciiTheme="minorBidi" w:hAnsiTheme="minorBidi" w:cstheme="minorBidi"/>
-          <w:sz w:val="18"/>
-          <w:szCs w:val="18"/>
-        </w:rPr>
-        <w:t>DE LOTIZACION</w:t>
-      </w:r>
-      <w:r>
-        <w:rPr>
-          <w:rFonts w:asciiTheme="minorBidi" w:hAnsiTheme="minorBidi" w:cstheme="minorBidi"/>
-          <w:sz w:val="18"/>
-          <w:szCs w:val="18"/>
-        </w:rPr>
-        <w:t xml:space="preserve"> DENOMINADO </w:t>
-      </w:r>
-      <w:r>
-        <w:rPr>
-          <w:rFonts w:asciiTheme="minorBidi" w:hAnsiTheme="minorBidi" w:cstheme="minorBidi"/>
-          <w:b/>
-          <w:bCs/>
-          <w:sz w:val="18"/>
-          <w:szCs w:val="18"/>
-        </w:rPr>
-        <w:t>“</w:t>
-      </w:r>
-      <w:r>
-        <w:rPr>
-          <w:rFonts w:asciiTheme="minorBidi" w:hAnsiTheme="minorBidi" w:cstheme="minorBidi"/>
-          <w:b/>
-          <w:bCs/>
-          <w:sz w:val="18"/>
-          <w:szCs w:val="18"/>
-        </w:rPr>
-        <w:t>SOL &amp; LUNA MALABRIGO CAMPO CLUB</w:t>
-      </w:r>
-      <w:r>
-        <w:rPr>
-          <w:rFonts w:asciiTheme="minorBidi" w:hAnsiTheme="minorBidi" w:cstheme="minorBidi"/>
-          <w:b/>
-          <w:bCs/>
-          <w:sz w:val="18"/>
-          <w:szCs w:val="18"/>
-        </w:rPr>
-        <w:t>”</w:t>
-      </w:r>
-      <w:r>
-        <w:rPr>
-          <w:rFonts w:asciiTheme="minorBidi" w:hAnsiTheme="minorBidi" w:cstheme="minorBidi"/>
-          <w:sz w:val="18"/>
-          <w:szCs w:val="18"/>
-        </w:rPr>
-        <w:t xml:space="preserve">, </w:t>
-      </w:r>
-      <w:r>
-        <w:rPr>
-          <w:rFonts w:asciiTheme="minorBidi" w:hAnsiTheme="minorBidi" w:cstheme="minorBidi"/>
-          <w:sz w:val="18"/>
-          <w:szCs w:val="18"/>
-        </w:rPr>
-        <w:t>CUYAS</w:t>
-      </w:r>
-      <w:r>
-        <w:rPr>
-          <w:rFonts w:asciiTheme="minorBidi" w:hAnsiTheme="minorBidi" w:cstheme="minorBidi"/>
-          <w:sz w:val="18"/>
-          <w:szCs w:val="18"/>
-        </w:rPr>
-        <w:t xml:space="preserve"> CARACTERISTICAS ESTAN SEÑALADAS EN LA MEMORIA DESCRIPTIVA </w:t>
-      </w:r>
-      <w:r>
-        <w:rPr>
-          <w:rFonts w:asciiTheme="minorBidi" w:hAnsiTheme="minorBidi" w:cstheme="minorBidi"/>
-          <w:sz w:val="18"/>
-          <w:szCs w:val="18"/>
-        </w:rPr>
-        <w:t xml:space="preserve">AL CUAL TIENE LIBRE ACCESO </w:t>
-      </w:r>
-      <w:r>
-        <w:rPr>
-          <w:rFonts w:asciiTheme="minorBidi" w:hAnsiTheme="minorBidi" w:cstheme="minorBidi"/>
-          <w:b/>
-          <w:bCs/>
-          <w:sz w:val="18"/>
-          <w:szCs w:val="18"/>
-        </w:rPr>
-        <w:t>«_PROMT»</w:t>
-      </w:r>
-      <w:r>
-        <w:rPr>
-          <w:rFonts w:asciiTheme="minorBidi" w:hAnsiTheme="minorBidi" w:cstheme="minorBidi"/>
-          <w:sz w:val="18"/>
-          <w:szCs w:val="18"/>
-        </w:rPr>
-        <w:t xml:space="preserve">; QUE ES MATERIA DE VENTA COMO BIEN FUTURO, Y QUE EN ADELANTE SERÁ DENOMINADO COMO </w:t>
-      </w:r>
-      <w:r>
-        <w:rPr>
-          <w:rFonts w:asciiTheme="minorBidi" w:hAnsiTheme="minorBidi" w:cstheme="minorBidi"/>
-          <w:b/>
-          <w:bCs/>
-          <w:sz w:val="18"/>
-          <w:szCs w:val="18"/>
-        </w:rPr>
-        <w:t>EL INMUEBLE</w:t>
-      </w:r>
-      <w:r>
-        <w:rPr>
-          <w:rFonts w:asciiTheme="minorBidi" w:hAnsiTheme="minorBidi" w:cstheme="minorBidi"/>
-          <w:sz w:val="18"/>
-          <w:szCs w:val="18"/>
-        </w:rPr>
-        <w:t>.</w:t>
-      </w:r>
-      <w:r>
-        <w:rPr>
-          <w:rFonts w:asciiTheme="minorBidi" w:hAnsiTheme="minorBidi" w:cstheme="minorBidi"/>
-          <w:sz w:val="18"/>
-          <w:szCs w:val="18"/>
-        </w:rPr>
-        <w:t xml:space="preserve"> </w:t>
-      </w:r>
-    </w:p>
-    <w:p>
-      <w:pPr>
-        <w:pStyle w:val="NormalWeb"/>
-        <w:spacing w:before="0" w:beforeAutospacing="0" w:after="0" w:afterAutospacing="0" w:line="336" w:lineRule="auto"/>
-        <w:jc w:val="both"/>
-        <w:rPr>
-          <w:rFonts w:asciiTheme="minorBidi" w:hAnsiTheme="minorBidi" w:cstheme="minorBidi"/>
-          <w:sz w:val="18"/>
-          <w:szCs w:val="18"/>
-        </w:rPr>
-      </w:pPr>
-      <w:r>
-        <w:rPr>
-          <w:rFonts w:asciiTheme="minorBidi" w:hAnsiTheme="minorBidi" w:cstheme="minorBidi"/>
-          <w:sz w:val="18"/>
-          <w:szCs w:val="18"/>
-        </w:rPr>
-        <w:t>AMBAS PARTES CELEBRAN ESTE CONTRATO DE COMPRAVENTA DE BIEN FUTURO, CONFORME A LO ESTABLECIDO POR EL ARTÍCULO 1534</w:t>
-      </w:r>
-      <w:r>
-        <w:rPr>
-          <w:rFonts w:asciiTheme="minorBidi" w:hAnsiTheme="minorBidi" w:cstheme="minorBidi"/>
-          <w:sz w:val="18"/>
-          <w:szCs w:val="18"/>
-        </w:rPr>
-        <w:t>°</w:t>
-      </w:r>
-      <w:r>
-        <w:rPr>
-          <w:rFonts w:asciiTheme="minorBidi" w:hAnsiTheme="minorBidi" w:cstheme="minorBidi"/>
-          <w:sz w:val="18"/>
-          <w:szCs w:val="18"/>
-        </w:rPr>
-        <w:t xml:space="preserve"> DEL CÓDIGO CIVIL, RESPECTO DE EL INMUEBLE ANTES MENCIONADO, EL MISMO QUE SERA</w:t>
-      </w:r>
-      <w:r>
-        <w:rPr>
-          <w:rFonts w:asciiTheme="minorBidi" w:hAnsiTheme="minorBidi" w:cstheme="minorBidi"/>
-          <w:sz w:val="18"/>
-          <w:szCs w:val="18"/>
-        </w:rPr>
-        <w:t xml:space="preserve"> </w:t>
-      </w:r>
-      <w:r>
-        <w:rPr>
-          <w:rFonts w:asciiTheme="minorBidi" w:hAnsiTheme="minorBidi" w:cstheme="minorBidi"/>
-          <w:sz w:val="18"/>
-          <w:szCs w:val="18"/>
-        </w:rPr>
-        <w:t>UN LOTE</w:t>
-      </w:r>
-      <w:r>
-        <w:rPr>
-          <w:rFonts w:asciiTheme="minorBidi" w:hAnsiTheme="minorBidi" w:cstheme="minorBidi"/>
-          <w:sz w:val="18"/>
-          <w:szCs w:val="18"/>
-        </w:rPr>
-        <w:t xml:space="preserve"> </w:t>
-      </w:r>
-      <w:r>
-        <w:rPr>
-          <w:rFonts w:asciiTheme="minorBidi" w:hAnsiTheme="minorBidi" w:cstheme="minorBidi"/>
-          <w:sz w:val="18"/>
-          <w:szCs w:val="18"/>
-        </w:rPr>
-        <w:t>D</w:t>
-      </w:r>
-      <w:r>
-        <w:rPr>
-          <w:rFonts w:asciiTheme="minorBidi" w:hAnsiTheme="minorBidi" w:cstheme="minorBidi"/>
-          <w:sz w:val="18"/>
-          <w:szCs w:val="18"/>
-        </w:rPr>
-        <w:t>EL PREDIO MATRIZ</w:t>
-      </w:r>
-      <w:r>
-        <w:rPr>
-          <w:rFonts w:asciiTheme="minorBidi" w:hAnsiTheme="minorBidi" w:cstheme="minorBidi"/>
-          <w:sz w:val="18"/>
-          <w:szCs w:val="18"/>
-        </w:rPr>
-        <w:t xml:space="preserve"> </w:t>
-      </w:r>
-      <w:r>
-        <w:rPr>
-          <w:rFonts w:asciiTheme="minorBidi" w:hAnsiTheme="minorBidi" w:cstheme="minorBidi"/>
-          <w:sz w:val="18"/>
-          <w:szCs w:val="18"/>
-        </w:rPr>
-        <w:t>DESCRITO</w:t>
-      </w:r>
-      <w:r>
-        <w:rPr>
-          <w:rFonts w:asciiTheme="minorBidi" w:hAnsiTheme="minorBidi" w:cstheme="minorBidi"/>
-          <w:sz w:val="18"/>
-          <w:szCs w:val="18"/>
-        </w:rPr>
-        <w:t xml:space="preserve"> </w:t>
-      </w:r>
-      <w:r>
-        <w:rPr>
-          <w:rFonts w:asciiTheme="minorBidi" w:hAnsiTheme="minorBidi" w:cstheme="minorBidi"/>
-          <w:sz w:val="18"/>
-          <w:szCs w:val="18"/>
-        </w:rPr>
-        <w:t>EN</w:t>
-      </w:r>
-      <w:r>
-        <w:rPr>
-          <w:rFonts w:asciiTheme="minorBidi" w:hAnsiTheme="minorBidi" w:cstheme="minorBidi"/>
-          <w:sz w:val="18"/>
-          <w:szCs w:val="18"/>
-        </w:rPr>
-        <w:t xml:space="preserve"> </w:t>
-      </w:r>
-      <w:r>
-        <w:rPr>
-          <w:rFonts w:asciiTheme="minorBidi" w:hAnsiTheme="minorBidi" w:cstheme="minorBidi"/>
-          <w:sz w:val="18"/>
-          <w:szCs w:val="18"/>
-        </w:rPr>
-        <w:t>EL PRIMER</w:t>
-      </w:r>
-      <w:r>
-        <w:rPr>
-          <w:rFonts w:asciiTheme="minorBidi" w:hAnsiTheme="minorBidi" w:cstheme="minorBidi"/>
-          <w:sz w:val="18"/>
-          <w:szCs w:val="18"/>
-        </w:rPr>
-        <w:t xml:space="preserve"> </w:t>
-      </w:r>
-      <w:r>
-        <w:rPr>
-          <w:rFonts w:asciiTheme="minorBidi" w:hAnsiTheme="minorBidi" w:cstheme="minorBidi"/>
-          <w:sz w:val="18"/>
-          <w:szCs w:val="18"/>
-        </w:rPr>
-        <w:t>PARRAFO</w:t>
-      </w:r>
-      <w:r>
-        <w:rPr>
-          <w:rFonts w:asciiTheme="minorBidi" w:hAnsiTheme="minorBidi" w:cstheme="minorBidi"/>
-          <w:sz w:val="18"/>
-          <w:szCs w:val="18"/>
-        </w:rPr>
-        <w:t xml:space="preserve"> </w:t>
-      </w:r>
-      <w:r>
-        <w:rPr>
-          <w:rFonts w:asciiTheme="minorBidi" w:hAnsiTheme="minorBidi" w:cstheme="minorBidi"/>
-          <w:sz w:val="18"/>
-          <w:szCs w:val="18"/>
-        </w:rPr>
-        <w:t>DE LA PRESENTE CLAUSULA.</w:t>
-      </w:r>
-      <w:r>
-        <w:rPr>
-          <w:rFonts w:asciiTheme="minorBidi" w:hAnsiTheme="minorBidi" w:cstheme="minorBidi"/>
-          <w:sz w:val="18"/>
-          <w:szCs w:val="18"/>
-        </w:rPr>
-        <w:t xml:space="preserve"> </w:t>
-      </w:r>
-    </w:p>
-    <w:p>
-      <w:pPr>
-        <w:pStyle w:val="NormalWeb"/>
-        <w:spacing w:before="0" w:beforeAutospacing="0" w:after="0" w:afterAutospacing="0" w:line="336" w:lineRule="auto"/>
-        <w:jc w:val="both"/>
-        <w:rPr>
-          <w:rFonts w:asciiTheme="minorBidi" w:hAnsiTheme="minorBidi" w:cstheme="minorBidi"/>
-          <w:sz w:val="18"/>
-          <w:szCs w:val="18"/>
-        </w:rPr>
-      </w:pPr>
-      <w:proofErr w:type="gramStart"/>
-      <w:r>
-        <w:rPr>
-          <w:rFonts w:asciiTheme="minorBidi" w:hAnsiTheme="minorBidi" w:cstheme="minorBidi"/>
-          <w:b/>
-          <w:bCs/>
-          <w:sz w:val="18"/>
-          <w:szCs w:val="18"/>
-        </w:rPr>
-        <w:t>SEGUNDA</w:t>
-      </w:r>
-      <w:r>
-        <w:rPr>
-          <w:rFonts w:asciiTheme="minorBidi" w:hAnsiTheme="minorBidi" w:cstheme="minorBidi"/>
-          <w:sz w:val="18"/>
-          <w:szCs w:val="18"/>
-        </w:rPr>
-        <w:t>.-</w:t>
-      </w:r>
-      <w:proofErr w:type="gramEnd"/>
-      <w:r>
-        <w:rPr>
-          <w:rFonts w:asciiTheme="minorBidi" w:hAnsiTheme="minorBidi" w:cstheme="minorBidi"/>
-          <w:sz w:val="18"/>
-          <w:szCs w:val="18"/>
-        </w:rPr>
-        <w:t xml:space="preserve"> SOBRE LA CELEBRACIÓN DEL CONTRATO PREPARATORIO DE COMPRAVENTA DE BIEN FUTURO.</w:t>
-      </w:r>
-      <w:r>
-        <w:rPr>
-          <w:rFonts w:asciiTheme="minorBidi" w:hAnsiTheme="minorBidi" w:cstheme="minorBidi"/>
-          <w:sz w:val="18"/>
-          <w:szCs w:val="18"/>
-        </w:rPr>
-        <w:t xml:space="preserve"> </w:t>
-      </w:r>
-    </w:p>
-    <w:p>
-      <w:pPr>
-        <w:pStyle w:val="NormalWeb"/>
-        <w:spacing w:before="0" w:beforeAutospacing="0" w:after="0" w:afterAutospacing="0" w:line="336" w:lineRule="auto"/>
-        <w:jc w:val="both"/>
-        <w:rPr>
-          <w:rFonts w:asciiTheme="minorBidi" w:hAnsiTheme="minorBidi" w:cstheme="minorBidi"/>
-          <w:sz w:val="18"/>
-          <w:szCs w:val="18"/>
-        </w:rPr>
-      </w:pPr>
-      <w:r>
-        <w:rPr>
-          <w:rFonts w:asciiTheme="minorBidi" w:hAnsiTheme="minorBidi" w:cstheme="minorBidi"/>
-          <w:sz w:val="18"/>
-          <w:szCs w:val="18"/>
-        </w:rPr>
-        <w:t xml:space="preserve">LAS PARTES RECONOCEN Y DECLARAN QUE </w:t>
-      </w:r>
-      <w:r>
-        <w:rPr>
-          <w:rFonts w:asciiTheme="minorBidi" w:hAnsiTheme="minorBidi" w:cstheme="minorBidi"/>
-          <w:sz w:val="18"/>
-          <w:szCs w:val="18"/>
-        </w:rPr>
-        <w:t>ANTERIOR A ESTA MINUTA,</w:t>
-      </w:r>
-      <w:r>
-        <w:rPr>
-          <w:rFonts w:asciiTheme="minorBidi" w:hAnsiTheme="minorBidi" w:cstheme="minorBidi"/>
-          <w:sz w:val="18"/>
-          <w:szCs w:val="18"/>
-        </w:rPr>
-        <w:t xml:space="preserve"> CELEBRARON Y SUSCRIBIERON UN CONTRATO </w:t>
-      </w:r>
-      <w:r>
-        <w:rPr>
-          <w:rFonts w:asciiTheme="minorBidi" w:hAnsiTheme="minorBidi" w:cstheme="minorBidi"/>
-          <w:sz w:val="18"/>
-          <w:szCs w:val="18"/>
-        </w:rPr>
-        <w:t>DE PROMESA DE VENTA</w:t>
-      </w:r>
-      <w:r>
-        <w:rPr>
-          <w:rFonts w:asciiTheme="minorBidi" w:hAnsiTheme="minorBidi" w:cstheme="minorBidi"/>
-          <w:sz w:val="18"/>
-          <w:szCs w:val="18"/>
-        </w:rPr>
-        <w:t xml:space="preserve">, EN CONSECUENCIA, CON LA CELEBRACION DEL PRESENTE CONTRATO DEFINITIVO DE COMPRAVENTA, DENTRO DEL PLAZO PACTADO, SE ESTA CUMPLIENDO CON LOS COMPROMISOS Y ACUERDOS CONTENIDOS EN EL MENCIONADO CONTRATO </w:t>
-      </w:r>
-      <w:r>
-        <w:rPr>
-          <w:rFonts w:asciiTheme="minorBidi" w:hAnsiTheme="minorBidi" w:cstheme="minorBidi"/>
-          <w:sz w:val="18"/>
-          <w:szCs w:val="18"/>
-        </w:rPr>
-        <w:t>PRIVADO DE PROMESA DE VENTA</w:t>
-      </w:r>
-      <w:r>
-        <w:rPr>
-          <w:rFonts w:asciiTheme="minorBidi" w:hAnsiTheme="minorBidi" w:cstheme="minorBidi"/>
-          <w:sz w:val="18"/>
-          <w:szCs w:val="18"/>
-        </w:rPr>
-        <w:t>.</w:t>
-      </w:r>
-      <w:r>
-        <w:rPr>
-          <w:rFonts w:asciiTheme="minorBidi" w:hAnsiTheme="minorBidi" w:cstheme="minorBidi"/>
-          <w:sz w:val="18"/>
-          <w:szCs w:val="18"/>
-        </w:rPr>
-        <w:t xml:space="preserve"> </w:t>
-      </w:r>
-    </w:p>
-    <w:p>
-      <w:pPr>
-        <w:pStyle w:val="NormalWeb"/>
-        <w:spacing w:before="0" w:beforeAutospacing="0" w:after="0" w:afterAutospacing="0" w:line="336" w:lineRule="auto"/>
-        <w:jc w:val="both"/>
-        <w:rPr>
-          <w:rFonts w:asciiTheme="minorBidi" w:hAnsiTheme="minorBidi" w:cstheme="minorBidi"/>
-          <w:sz w:val="18"/>
-          <w:szCs w:val="18"/>
-        </w:rPr>
-      </w:pPr>
-      <w:r>
-        <w:rPr>
-          <w:rFonts w:asciiTheme="minorBidi" w:hAnsiTheme="minorBidi" w:cstheme="minorBidi"/>
-          <w:sz w:val="18"/>
-          <w:szCs w:val="18"/>
-        </w:rPr>
-        <w:t xml:space="preserve">ASIMISMO, LAS PARTES RECONOCEN Y DECLARAN QUE EN CASO DE DISCREPANCIA O DISCONFORMIDAD ENTRE LOS ACUERDOS ADOPTADOS EN EL CONTRATO </w:t>
-      </w:r>
-      <w:r>
-        <w:rPr>
-          <w:rFonts w:asciiTheme="minorBidi" w:hAnsiTheme="minorBidi" w:cstheme="minorBidi"/>
-          <w:sz w:val="18"/>
-          <w:szCs w:val="18"/>
-        </w:rPr>
-        <w:t>PRIVADO</w:t>
-      </w:r>
-      <w:r>
-        <w:rPr>
-          <w:rFonts w:asciiTheme="minorBidi" w:hAnsiTheme="minorBidi" w:cstheme="minorBidi"/>
-          <w:sz w:val="18"/>
-          <w:szCs w:val="18"/>
-        </w:rPr>
-        <w:t xml:space="preserve"> Y EL PRESENTE CONTRATO DEFINITIVO, PREVALECEN LOS ACUERDOS DEL CONTRATO DEFINITIVO.</w:t>
-      </w:r>
-      <w:r>
-        <w:rPr>
-          <w:rFonts w:asciiTheme="minorBidi" w:hAnsiTheme="minorBidi" w:cstheme="minorBidi"/>
-          <w:sz w:val="18"/>
-          <w:szCs w:val="18"/>
-        </w:rPr>
-        <w:t xml:space="preserve"> </w:t>
-      </w:r>
-    </w:p>
-    <w:p>
-      <w:pPr>
-        <w:pStyle w:val="NormalWeb"/>
-        <w:spacing w:before="0" w:beforeAutospacing="0" w:after="0" w:afterAutospacing="0" w:line="336" w:lineRule="auto"/>
-        <w:jc w:val="both"/>
-        <w:rPr>
-          <w:rFonts w:asciiTheme="minorBidi" w:hAnsiTheme="minorBidi" w:cstheme="minorBidi"/>
-          <w:sz w:val="18"/>
-          <w:szCs w:val="18"/>
-        </w:rPr>
-      </w:pPr>
-      <w:proofErr w:type="gramStart"/>
-      <w:r>
-        <w:rPr>
-          <w:rFonts w:asciiTheme="minorBidi" w:hAnsiTheme="minorBidi" w:cstheme="minorBidi"/>
-          <w:b/>
-          <w:bCs/>
-          <w:sz w:val="18"/>
-          <w:szCs w:val="18"/>
-        </w:rPr>
-        <w:t>TERCERA</w:t>
-      </w:r>
-      <w:r>
-        <w:rPr>
-          <w:rFonts w:asciiTheme="minorBidi" w:hAnsiTheme="minorBidi" w:cstheme="minorBidi"/>
-          <w:sz w:val="18"/>
-          <w:szCs w:val="18"/>
-        </w:rPr>
-        <w:t>.-</w:t>
-      </w:r>
-      <w:proofErr w:type="gramEnd"/>
-      <w:r>
-        <w:rPr>
-          <w:rFonts w:asciiTheme="minorBidi" w:hAnsiTheme="minorBidi" w:cstheme="minorBidi"/>
-          <w:sz w:val="18"/>
-          <w:szCs w:val="18"/>
-        </w:rPr>
-        <w:t xml:space="preserve"> IMPORTE DE VENTA Y FORMA DE PAGO</w:t>
-      </w:r>
-      <w:r>
-        <w:rPr>
-          <w:rFonts w:asciiTheme="minorBidi" w:hAnsiTheme="minorBidi" w:cstheme="minorBidi"/>
-          <w:sz w:val="18"/>
-          <w:szCs w:val="18"/>
-        </w:rPr>
-        <w:t xml:space="preserve">: </w:t>
-      </w:r>
-    </w:p>
-    <w:p>
-      <w:pPr>
-        <w:pStyle w:val="NormalWeb"/>
-        <w:spacing w:before="0" w:beforeAutospacing="0" w:after="0" w:afterAutospacing="0" w:line="336" w:lineRule="auto"/>
-        <w:jc w:val="both"/>
-        <w:rPr>
-          <w:rFonts w:asciiTheme="minorBidi" w:hAnsiTheme="minorBidi" w:cstheme="minorBidi"/>
-          <w:sz w:val="18"/>
-          <w:szCs w:val="18"/>
-        </w:rPr>
-      </w:pPr>
-      <w:r>
-        <w:rPr>
-          <w:rFonts w:asciiTheme="minorBidi" w:hAnsiTheme="minorBidi" w:cstheme="minorBidi"/>
-          <w:sz w:val="18"/>
-          <w:szCs w:val="18"/>
-        </w:rPr>
-        <w:t xml:space="preserve">POR INTERMEDIO DEL PRESENTE CONTRATO, </w:t>
-      </w:r>
-      <w:r>
-        <w:rPr>
-          <w:rFonts w:asciiTheme="minorBidi" w:hAnsiTheme="minorBidi" w:cstheme="minorBidi"/>
-          <w:b/>
-          <w:bCs/>
-          <w:sz w:val="18"/>
-          <w:szCs w:val="18"/>
-        </w:rPr>
-        <w:t>LA VENDEDORA</w:t>
-      </w:r>
-      <w:r>
-        <w:rPr>
-          <w:rFonts w:asciiTheme="minorBidi" w:hAnsiTheme="minorBidi" w:cstheme="minorBidi"/>
-          <w:sz w:val="18"/>
-          <w:szCs w:val="18"/>
-        </w:rPr>
-        <w:t>, TRANSFIERE, EN VENTA REAL Y ENAJENACION PERPETUA</w:t>
-      </w:r>
-      <w:r>
-        <w:rPr>
-          <w:rFonts w:asciiTheme="minorBidi" w:hAnsiTheme="minorBidi" w:cstheme="minorBidi"/>
-          <w:sz w:val="18"/>
-          <w:szCs w:val="18"/>
-        </w:rPr>
-        <w:t xml:space="preserve">, EL </w:t>
-      </w:r>
-      <w:r>
-        <w:rPr>
-          <w:rFonts w:asciiTheme="minorBidi" w:hAnsiTheme="minorBidi" w:cstheme="minorBidi"/>
-          <w:b/>
-          <w:bCs/>
-          <w:sz w:val="18"/>
-          <w:szCs w:val="18"/>
-        </w:rPr>
-        <w:t xml:space="preserve">LOTE «LOTE», </w:t>
-      </w:r>
-      <w:r>
-        <w:rPr>
-          <w:rFonts w:asciiTheme="minorBidi" w:hAnsiTheme="minorBidi" w:cstheme="minorBidi"/>
-          <w:sz w:val="18"/>
-          <w:szCs w:val="18"/>
-        </w:rPr>
-        <w:t xml:space="preserve">DE LA </w:t>
-      </w:r>
-      <w:r>
-        <w:rPr>
-          <w:rFonts w:asciiTheme="minorBidi" w:hAnsiTheme="minorBidi" w:cstheme="minorBidi"/>
-          <w:b/>
-          <w:bCs/>
-          <w:sz w:val="18"/>
-          <w:szCs w:val="18"/>
-        </w:rPr>
-        <w:t xml:space="preserve">MANZANA «MZ», </w:t>
-      </w:r>
-      <w:r>
-        <w:rPr>
-          <w:rFonts w:asciiTheme="minorBidi" w:hAnsiTheme="minorBidi" w:cstheme="minorBidi"/>
-          <w:sz w:val="18"/>
-          <w:szCs w:val="18"/>
-        </w:rPr>
-        <w:t xml:space="preserve">CON UN AREA DE </w:t>
-      </w:r>
-      <w:r>
-        <w:rPr>
-          <w:rFonts w:asciiTheme="minorBidi" w:hAnsiTheme="minorBidi" w:cstheme="minorBidi"/>
-          <w:b/>
-          <w:bCs/>
-          <w:sz w:val="18"/>
-          <w:szCs w:val="18"/>
-        </w:rPr>
-        <w:t xml:space="preserve">«_AREA» M2 («_AREA_TEXTO» METROS CUADRADOS) </w:t>
-      </w:r>
-      <w:r>
-        <w:rPr>
-          <w:rFonts w:asciiTheme="minorBidi" w:hAnsiTheme="minorBidi" w:cstheme="minorBidi"/>
-          <w:sz w:val="18"/>
-          <w:szCs w:val="18"/>
-        </w:rPr>
-        <w:t xml:space="preserve">DEL PROYECTO DENOMINADO </w:t>
-      </w:r>
-      <w:r>
-        <w:rPr>
-          <w:rFonts w:asciiTheme="minorBidi" w:hAnsiTheme="minorBidi" w:cstheme="minorBidi"/>
-          <w:b/>
-          <w:bCs/>
-          <w:sz w:val="18"/>
-          <w:szCs w:val="18"/>
-        </w:rPr>
-        <w:t>“</w:t>
-      </w:r>
-      <w:r>
-        <w:rPr>
-          <w:rFonts w:asciiTheme="minorBidi" w:hAnsiTheme="minorBidi" w:cstheme="minorBidi"/>
-          <w:b/>
-          <w:bCs/>
-          <w:sz w:val="18"/>
-          <w:szCs w:val="18"/>
-        </w:rPr>
-        <w:t xml:space="preserve">SOL &amp; LUNA MALABRIGO </w:t>
-      </w:r>
-      <w:r>
-        <w:rPr>
-          <w:rFonts w:asciiTheme="minorBidi" w:hAnsiTheme="minorBidi" w:cstheme="minorBidi"/>
-          <w:b/>
-          <w:bCs/>
-          <w:sz w:val="18"/>
-          <w:szCs w:val="18"/>
-        </w:rPr>
-        <w:lastRenderedPageBreak/>
-        <w:t>CAMPO CLUB</w:t>
-      </w:r>
-      <w:r>
-        <w:rPr>
-          <w:rFonts w:asciiTheme="minorBidi" w:hAnsiTheme="minorBidi" w:cstheme="minorBidi"/>
-          <w:b/>
-          <w:bCs/>
-          <w:sz w:val="18"/>
-          <w:szCs w:val="18"/>
-        </w:rPr>
-        <w:t>”</w:t>
-      </w:r>
-      <w:r>
-        <w:rPr>
-          <w:rFonts w:asciiTheme="minorBidi" w:hAnsiTheme="minorBidi" w:cstheme="minorBidi"/>
-          <w:sz w:val="18"/>
-          <w:szCs w:val="18"/>
-        </w:rPr>
-        <w:t xml:space="preserve"> A FAVOR DE </w:t>
-      </w:r>
-      <w:r>
-        <w:rPr>
-          <w:rFonts w:asciiTheme="minorBidi" w:hAnsiTheme="minorBidi" w:cstheme="minorBidi"/>
-          <w:b/>
-          <w:bCs/>
-          <w:sz w:val="18"/>
-          <w:szCs w:val="18"/>
-        </w:rPr>
-        <w:t>«_PROMT»</w:t>
-      </w:r>
-      <w:r>
-        <w:rPr>
-          <w:rFonts w:asciiTheme="minorBidi" w:hAnsiTheme="minorBidi" w:cstheme="minorBidi"/>
-          <w:sz w:val="18"/>
-          <w:szCs w:val="18"/>
-        </w:rPr>
-        <w:t xml:space="preserve">, POR LA SUMA TOTAL DE </w:t>
-      </w:r>
-      <w:r>
-        <w:rPr>
-          <w:rFonts w:asciiTheme="minorBidi" w:hAnsiTheme="minorBidi" w:cstheme="minorBidi"/>
-          <w:b/>
-          <w:sz w:val="18"/>
-          <w:szCs w:val="18"/>
-        </w:rPr>
-        <w:t>S</w:t>
-      </w:r>
-      <w:proofErr w:type="gramStart"/>
-      <w:r>
-        <w:rPr>
-          <w:rFonts w:asciiTheme="minorBidi" w:hAnsiTheme="minorBidi" w:cstheme="minorBidi"/>
-          <w:b/>
-          <w:sz w:val="18"/>
-          <w:szCs w:val="18"/>
-        </w:rPr>
-        <w:t>/«</w:t>
-      </w:r>
-      <w:proofErr w:type="gramEnd"/>
-      <w:r>
-        <w:rPr>
-          <w:rFonts w:asciiTheme="minorBidi" w:hAnsiTheme="minorBidi" w:cstheme="minorBidi"/>
-          <w:b/>
-          <w:sz w:val="18"/>
-          <w:szCs w:val="18"/>
-        </w:rPr>
-        <w:t>_PRECIO»(«_PRECIO_TEXTO» Y «_PRECIO_DECIMAL»/100 SOLES)</w:t>
-      </w:r>
-      <w:r>
-        <w:rPr>
-          <w:rFonts w:asciiTheme="minorBidi" w:hAnsiTheme="minorBidi" w:cstheme="minorBidi"/>
-          <w:sz w:val="18"/>
-          <w:szCs w:val="18"/>
-        </w:rPr>
-        <w:t>.</w:t>
-      </w:r>
-      <w:r>
-        <w:rPr>
-          <w:rFonts w:asciiTheme="minorBidi" w:hAnsiTheme="minorBidi" w:cstheme="minorBidi"/>
-          <w:sz w:val="18"/>
-          <w:szCs w:val="18"/>
-        </w:rPr>
-        <w:t xml:space="preserve"> </w:t>
       </w:r>
     </w:p>
     <w:p>
@@ -1364,13 +396,27 @@
           <w:szCs w:val="18"/>
         </w:rPr>
       </w:pPr>
-      <w:r>
-        <w:rPr>
-          <w:rFonts w:asciiTheme="minorBidi" w:hAnsiTheme="minorBidi" w:cstheme="minorBidi"/>
-          <w:sz w:val="18"/>
-          <w:szCs w:val="18"/>
-        </w:rPr>
-        <w:t xml:space="preserve">LA PRESENTE COMPRAVENTA SE ENCUENTRA SUJETA A LA CONDICIÓN SUSPENSIVA QUE DICHO INMUEBLE LLEGUE A INDEPENDIZARSE, Y TRATANDOSE DE BIEN FUTURO, EL PRECIO TOTAL ANTES INDICADO, SE CANCELARA DE LA SIGUIENTE MANERA: </w:t>
+      <w:proofErr w:type="gramStart"/>
+      <w:r>
+        <w:rPr>
+          <w:rFonts w:asciiTheme="minorBidi" w:hAnsiTheme="minorBidi" w:cstheme="minorBidi"/>
+          <w:b/>
+          <w:sz w:val="18"/>
+          <w:szCs w:val="18"/>
+          <w:u w:val="single"/>
+        </w:rPr>
+        <w:t>PRIMERA.-</w:t>
+      </w:r>
+      <w:proofErr w:type="gramEnd"/>
+      <w:r>
+        <w:rPr>
+          <w:rFonts w:asciiTheme="minorBidi" w:hAnsiTheme="minorBidi" w:cstheme="minorBidi"/>
+          <w:b/>
+          <w:sz w:val="18"/>
+          <w:szCs w:val="18"/>
+          <w:u w:val="single"/>
+        </w:rPr>
+        <w:t xml:space="preserve"> ANTECEDENTES </w:t>
       </w:r>
     </w:p>
     <w:p>
@@ -1387,50 +433,232 @@
       <w:r>
         <w:rPr>
           <w:rFonts w:asciiTheme="minorBidi" w:hAnsiTheme="minorBidi" w:cstheme="minorBidi"/>
-          <w:sz w:val="18"/>
-          <w:szCs w:val="18"/>
-        </w:rPr>
-        <w:t xml:space="preserve">3.1.- EL IMPORTE DE </w:t>
-      </w:r>
-      <w:r>
-        <w:rPr>
-          <w:rFonts w:asciiTheme="minorBidi" w:hAnsiTheme="minorBidi" w:cstheme="minorBidi"/>
-          <w:b/>
-          <w:bCs/>
-          <w:sz w:val="18"/>
-          <w:szCs w:val="18"/>
-        </w:rPr>
-        <w:t>S</w:t>
-      </w:r>
-      <w:proofErr w:type="gramStart"/>
-      <w:r>
-        <w:rPr>
-          <w:rFonts w:asciiTheme="minorBidi" w:hAnsiTheme="minorBidi" w:cstheme="minorBidi"/>
-          <w:b/>
-          <w:bCs/>
-          <w:sz w:val="18"/>
-          <w:szCs w:val="18"/>
-        </w:rPr>
-        <w:t>/«</w:t>
-      </w:r>
-      <w:proofErr w:type="gramEnd"/>
-      <w:r>
-        <w:rPr>
-          <w:rFonts w:asciiTheme="minorBidi" w:hAnsiTheme="minorBidi" w:cstheme="minorBidi"/>
-          <w:b/>
-          <w:bCs/>
-          <w:sz w:val="18"/>
-          <w:szCs w:val="18"/>
-        </w:rPr>
-        <w:t>_PAGO»(«_PAGO_TEXTO» Y «_PAGO_DECIMAL»/100 SOLES)</w:t>
-      </w:r>
-      <w:r>
-        <w:rPr>
-          <w:rFonts w:asciiTheme="minorBidi" w:hAnsiTheme="minorBidi" w:cstheme="minorBidi"/>
-          <w:sz w:val="18"/>
-          <w:szCs w:val="18"/>
-        </w:rPr>
-        <w:t xml:space="preserve">, HAN SIDO CANCELADOS CON RECURSOS PROPIOS DE LOS COMPRADORES EN EL CUAL SE INCLUYE LA SUMA ENTREGADA POR LOS COMPRADORES A TITULO DE ARRAS AL MOMENTO DE LA CELEBRACION DEL CONTRATO PRIVADO DE PROMESA DE VENTA, DESCRITO EN LA CLAUSULA SEGUNDA, Y QUE LAS PARTES ACUERDAN QUE SEAN IMPUTADAS COMO PAGO DEL PRECIO DE VENTA. </w:t>
+          <w:b/>
+          <w:sz w:val="18"/>
+          <w:szCs w:val="18"/>
+        </w:rPr>
+        <w:t>EL VENDEDOR</w:t>
+      </w:r>
+      <w:r>
+        <w:rPr>
+          <w:rFonts w:asciiTheme="minorBidi" w:hAnsiTheme="minorBidi" w:cstheme="minorBidi"/>
+          <w:sz w:val="18"/>
+          <w:szCs w:val="18"/>
+        </w:rPr>
+        <w:t xml:space="preserve"> </w:t>
+      </w:r>
+      <w:r>
+        <w:rPr>
+          <w:rFonts w:asciiTheme="minorBidi" w:hAnsiTheme="minorBidi" w:cstheme="minorBidi"/>
+          <w:sz w:val="18"/>
+          <w:szCs w:val="18"/>
+        </w:rPr>
+        <w:t>DECLARA SER PROPIETARIO DEL</w:t>
+      </w:r>
+      <w:r>
+        <w:rPr>
+          <w:rFonts w:asciiTheme="minorBidi" w:eastAsia="Calibri" w:hAnsiTheme="minorBidi" w:cstheme="minorBidi"/>
+          <w:sz w:val="18"/>
+          <w:szCs w:val="18"/>
+          <w:lang w:val="es-PE" w:eastAsia="en-US"/>
+        </w:rPr>
+        <w:t xml:space="preserve"> </w:t>
+      </w:r>
+      <w:r>
+        <w:rPr>
+          <w:rFonts w:asciiTheme="minorBidi" w:hAnsiTheme="minorBidi" w:cstheme="minorBidi"/>
+          <w:b/>
+          <w:bCs/>
+          <w:caps/>
+          <w:sz w:val="18"/>
+          <w:szCs w:val="18"/>
+        </w:rPr>
+        <w:t>«</w:t>
+      </w:r>
+      <w:r>
+        <w:rPr>
+          <w:rFonts w:asciiTheme="minorBidi" w:hAnsiTheme="minorBidi" w:cstheme="minorBidi"/>
+          <w:b/>
+          <w:bCs/>
+          <w:caps/>
+          <w:sz w:val="18"/>
+          <w:szCs w:val="18"/>
+        </w:rPr>
+        <w:t>NOMBRE_PREDIO</w:t>
+      </w:r>
+      <w:r>
+        <w:rPr>
+          <w:rFonts w:asciiTheme="minorBidi" w:hAnsiTheme="minorBidi" w:cstheme="minorBidi"/>
+          <w:b/>
+          <w:bCs/>
+          <w:caps/>
+          <w:sz w:val="18"/>
+          <w:szCs w:val="18"/>
+        </w:rPr>
+        <w:t>»,</w:t>
+      </w:r>
+      <w:r>
+        <w:rPr>
+          <w:rFonts w:asciiTheme="minorBidi" w:hAnsiTheme="minorBidi" w:cstheme="minorBidi"/>
+          <w:b/>
+          <w:bCs/>
+          <w:caps/>
+          <w:sz w:val="18"/>
+          <w:szCs w:val="18"/>
+        </w:rPr>
+        <w:t xml:space="preserve"> DISTRITO DE PAIJAN, PROVINCIA DE ASCOPE, DEPARTAMENTO DE LA LIBERTAD</w:t>
+      </w:r>
+      <w:r>
+        <w:rPr>
+          <w:rFonts w:asciiTheme="minorBidi" w:hAnsiTheme="minorBidi" w:cstheme="minorBidi"/>
+          <w:b/>
+          <w:sz w:val="18"/>
+          <w:szCs w:val="18"/>
+        </w:rPr>
+        <w:t>,</w:t>
+      </w:r>
+      <w:r>
+        <w:rPr>
+          <w:rFonts w:asciiTheme="minorBidi" w:hAnsiTheme="minorBidi" w:cstheme="minorBidi"/>
+          <w:sz w:val="18"/>
+          <w:szCs w:val="18"/>
+        </w:rPr>
+        <w:t xml:space="preserve"> CUYO DERECHO DE PROPIEDAD, ÁREA, LINDEROS, MEDIDAS PERIMETRICAS SE ENCUENTRAN INSCRITOS EN LA </w:t>
+      </w:r>
+      <w:r>
+        <w:rPr>
+          <w:rFonts w:asciiTheme="minorBidi" w:hAnsiTheme="minorBidi" w:cstheme="minorBidi"/>
+          <w:b/>
+          <w:sz w:val="18"/>
+          <w:szCs w:val="18"/>
+        </w:rPr>
+        <w:t xml:space="preserve">PARTIDA ELECTRONICA </w:t>
+      </w:r>
+      <w:proofErr w:type="spellStart"/>
+      <w:r>
+        <w:rPr>
+          <w:rFonts w:asciiTheme="minorBidi" w:hAnsiTheme="minorBidi" w:cstheme="minorBidi"/>
+          <w:b/>
+          <w:sz w:val="18"/>
+          <w:szCs w:val="18"/>
+        </w:rPr>
+        <w:t>Nº</w:t>
+      </w:r>
+      <w:proofErr w:type="spellEnd"/>
+      <w:r>
+        <w:rPr>
+          <w:rFonts w:asciiTheme="minorBidi" w:hAnsiTheme="minorBidi" w:cstheme="minorBidi"/>
+          <w:b/>
+          <w:sz w:val="18"/>
+          <w:szCs w:val="18"/>
+        </w:rPr>
+        <w:t xml:space="preserve"> </w:t>
+      </w:r>
+      <w:r>
+        <w:rPr>
+          <w:rFonts w:asciiTheme="minorBidi" w:hAnsiTheme="minorBidi" w:cstheme="minorBidi"/>
+          <w:b/>
+          <w:sz w:val="18"/>
+          <w:szCs w:val="18"/>
+        </w:rPr>
+        <w:t>«</w:t>
+      </w:r>
+      <w:r>
+        <w:rPr>
+          <w:rFonts w:asciiTheme="minorBidi" w:hAnsiTheme="minorBidi" w:cstheme="minorBidi"/>
+          <w:b/>
+          <w:sz w:val="18"/>
+          <w:szCs w:val="18"/>
+        </w:rPr>
+        <w:t>PARTIDA</w:t>
+      </w:r>
+      <w:r>
+        <w:rPr>
+          <w:rFonts w:asciiTheme="minorBidi" w:hAnsiTheme="minorBidi" w:cstheme="minorBidi"/>
+          <w:b/>
+          <w:sz w:val="18"/>
+          <w:szCs w:val="18"/>
+        </w:rPr>
+        <w:t>»</w:t>
+      </w:r>
+      <w:r>
+        <w:rPr>
+          <w:rFonts w:asciiTheme="minorBidi" w:hAnsiTheme="minorBidi" w:cstheme="minorBidi"/>
+          <w:sz w:val="18"/>
+          <w:szCs w:val="18"/>
+        </w:rPr>
+        <w:t>,</w:t>
+      </w:r>
+      <w:r>
+        <w:rPr>
+          <w:rFonts w:asciiTheme="minorBidi" w:hAnsiTheme="minorBidi" w:cstheme="minorBidi"/>
+          <w:b/>
+          <w:sz w:val="18"/>
+          <w:szCs w:val="18"/>
+        </w:rPr>
+        <w:t xml:space="preserve"> </w:t>
+      </w:r>
+      <w:r>
+        <w:rPr>
+          <w:rFonts w:asciiTheme="minorBidi" w:hAnsiTheme="minorBidi" w:cstheme="minorBidi"/>
+          <w:sz w:val="18"/>
+          <w:szCs w:val="18"/>
+        </w:rPr>
+        <w:t xml:space="preserve">DEL REGISTRO DE PREDIOS DE LA ZONA REGISTRAL </w:t>
+      </w:r>
+      <w:proofErr w:type="spellStart"/>
+      <w:r>
+        <w:rPr>
+          <w:rFonts w:asciiTheme="minorBidi" w:hAnsiTheme="minorBidi" w:cstheme="minorBidi"/>
+          <w:sz w:val="18"/>
+          <w:szCs w:val="18"/>
+        </w:rPr>
+        <w:t>Nº</w:t>
+      </w:r>
+      <w:proofErr w:type="spellEnd"/>
+      <w:r>
+        <w:rPr>
+          <w:rFonts w:asciiTheme="minorBidi" w:hAnsiTheme="minorBidi" w:cstheme="minorBidi"/>
+          <w:sz w:val="18"/>
+          <w:szCs w:val="18"/>
+        </w:rPr>
+        <w:t xml:space="preserve"> V – SEDE TRUJILLO, OFICINA REGISTRAL DE TRUJILLO</w:t>
+      </w:r>
+      <w:r>
+        <w:rPr>
+          <w:rFonts w:asciiTheme="minorBidi" w:hAnsiTheme="minorBidi" w:cstheme="minorBidi"/>
+          <w:bCs/>
+          <w:caps/>
+          <w:sz w:val="18"/>
+          <w:szCs w:val="18"/>
+        </w:rPr>
+        <w:t>;</w:t>
+      </w:r>
+      <w:r>
+        <w:rPr>
+          <w:rFonts w:asciiTheme="minorBidi" w:hAnsiTheme="minorBidi" w:cstheme="minorBidi"/>
+          <w:sz w:val="18"/>
+          <w:szCs w:val="18"/>
+        </w:rPr>
+        <w:t xml:space="preserve"> AL QUE EN ADELANTE SE LE DENOMINARA EL </w:t>
+      </w:r>
+      <w:r>
+        <w:rPr>
+          <w:rFonts w:asciiTheme="minorBidi" w:hAnsiTheme="minorBidi" w:cstheme="minorBidi"/>
+          <w:b/>
+          <w:bCs/>
+          <w:sz w:val="18"/>
+          <w:szCs w:val="18"/>
+        </w:rPr>
+        <w:t>PREDIO MATRIZ</w:t>
+      </w:r>
+      <w:r>
+        <w:rPr>
+          <w:rFonts w:asciiTheme="minorBidi" w:hAnsiTheme="minorBidi" w:cstheme="minorBidi"/>
+          <w:sz w:val="18"/>
+          <w:szCs w:val="18"/>
+        </w:rPr>
+        <w:t xml:space="preserve">. </w:t>
       </w:r>
     </w:p>
     <w:p>
@@ -1450,93 +678,173 @@
           <w:sz w:val="18"/>
           <w:szCs w:val="18"/>
         </w:rPr>
-        <w:t xml:space="preserve">3.2- EL SALDO POR LA SUMA DE </w:t>
-      </w:r>
-      <w:r>
-        <w:rPr>
-          <w:rFonts w:asciiTheme="minorBidi" w:hAnsiTheme="minorBidi" w:cstheme="minorBidi"/>
-          <w:b/>
-          <w:sz w:val="18"/>
-          <w:szCs w:val="18"/>
-        </w:rPr>
-        <w:t>S</w:t>
-      </w:r>
-      <w:proofErr w:type="gramStart"/>
-      <w:r>
-        <w:rPr>
-          <w:rFonts w:asciiTheme="minorBidi" w:hAnsiTheme="minorBidi" w:cstheme="minorBidi"/>
-          <w:b/>
-          <w:sz w:val="18"/>
-          <w:szCs w:val="18"/>
-        </w:rPr>
-        <w:t>/«</w:t>
-      </w:r>
-      <w:proofErr w:type="gramEnd"/>
-      <w:r>
-        <w:rPr>
-          <w:rFonts w:asciiTheme="minorBidi" w:hAnsiTheme="minorBidi" w:cstheme="minorBidi"/>
-          <w:b/>
-          <w:sz w:val="18"/>
-          <w:szCs w:val="18"/>
-        </w:rPr>
-        <w:t>_SALDO»(«_</w:t>
-      </w:r>
-      <w:r>
-        <w:rPr>
-          <w:rFonts w:ascii="Arial" w:hAnsi="Arial" w:cs="Arial"/>
-          <w:b/>
-          <w:sz w:val="18"/>
-          <w:szCs w:val="18"/>
-        </w:rPr>
-        <w:t>SALDO_TEXTO» Y «_SALDO_DECIMAL»/100 SOLES)</w:t>
-      </w:r>
-      <w:r>
-        <w:rPr>
-          <w:rFonts w:ascii="Arial" w:hAnsi="Arial" w:cs="Arial"/>
-          <w:sz w:val="18"/>
-          <w:szCs w:val="18"/>
-        </w:rPr>
-        <w:t xml:space="preserve"> SERAN CANCELADOS MEDIANTE DEPÓSITO BANCARIO, TRANSFERENCIA INTERBANCARIA, O CHEQUE DE GERENCIA, A FAVOR DE LA VENDEDORA, </w:t>
-      </w:r>
-      <w:r>
-        <w:rPr>
-          <w:rFonts w:ascii="Arial" w:hAnsi="Arial" w:cs="Arial"/>
-          <w:bCs/>
-          <w:sz w:val="18"/>
-          <w:szCs w:val="18"/>
-        </w:rPr>
-        <w:t xml:space="preserve">COMO PLAZO MAXIMO HASTA EL </w:t>
-      </w:r>
-      <w:r>
-        <w:rPr>
-          <w:rFonts w:ascii="Arial" w:hAnsi="Arial" w:cs="Arial"/>
-          <w:b/>
-          <w:sz w:val="18"/>
-          <w:szCs w:val="18"/>
-        </w:rPr>
-        <w:t>«FPAGOTOTAL_TEXTO»</w:t>
-      </w:r>
-      <w:r>
-        <w:rPr>
-          <w:rFonts w:ascii="Arial" w:hAnsi="Arial" w:cs="Arial"/>
-          <w:sz w:val="18"/>
-          <w:szCs w:val="18"/>
-        </w:rPr>
-        <w:t>, SIENDO LA SOLA FIRMA POR PARTE DE LA VENDEDORA EN LA ESCRITURA PUBLICA QUE DE ORIGEN LA PRESENTE MINUTA DE COMPRAVENTA CONSTANCIA SUFICIENTE DE SU CANCELACION TOTAL DEL PRECIO</w:t>
-      </w:r>
-      <w:r>
-        <w:rPr>
-          <w:rFonts w:asciiTheme="minorBidi" w:hAnsiTheme="minorBidi" w:cstheme="minorBidi"/>
-          <w:sz w:val="18"/>
-          <w:szCs w:val="18"/>
-        </w:rPr>
-        <w:t xml:space="preserve"> DE VENTA. </w:t>
+        <w:t xml:space="preserve">SOBRE EL INMUEBLE ANTES MENCIONADO </w:t>
+      </w:r>
+      <w:r>
+        <w:rPr>
+          <w:rFonts w:asciiTheme="minorBidi" w:hAnsiTheme="minorBidi" w:cstheme="minorBidi"/>
+          <w:b/>
+          <w:bCs/>
+          <w:sz w:val="18"/>
+          <w:szCs w:val="18"/>
+        </w:rPr>
+        <w:t>LA VENDEDORA</w:t>
+      </w:r>
+      <w:r>
+        <w:rPr>
+          <w:rFonts w:asciiTheme="minorBidi" w:hAnsiTheme="minorBidi" w:cstheme="minorBidi"/>
+          <w:sz w:val="18"/>
+          <w:szCs w:val="18"/>
+        </w:rPr>
+        <w:t xml:space="preserve"> HA PLANIFICADO EJECUTAR UN PROYECTO INMOBILIARIO </w:t>
+      </w:r>
+      <w:r>
+        <w:rPr>
+          <w:rFonts w:asciiTheme="minorBidi" w:hAnsiTheme="minorBidi" w:cstheme="minorBidi"/>
+          <w:sz w:val="18"/>
+          <w:szCs w:val="18"/>
+        </w:rPr>
+        <w:t>DE LOTIZACION</w:t>
+      </w:r>
+      <w:r>
+        <w:rPr>
+          <w:rFonts w:asciiTheme="minorBidi" w:hAnsiTheme="minorBidi" w:cstheme="minorBidi"/>
+          <w:sz w:val="18"/>
+          <w:szCs w:val="18"/>
+        </w:rPr>
+        <w:t xml:space="preserve"> DENOMINADO </w:t>
+      </w:r>
+      <w:r>
+        <w:rPr>
+          <w:rFonts w:asciiTheme="minorBidi" w:hAnsiTheme="minorBidi" w:cstheme="minorBidi"/>
+          <w:b/>
+          <w:bCs/>
+          <w:sz w:val="18"/>
+          <w:szCs w:val="18"/>
+        </w:rPr>
+        <w:t>“</w:t>
+      </w:r>
+      <w:r>
+        <w:rPr>
+          <w:rFonts w:asciiTheme="minorBidi" w:hAnsiTheme="minorBidi" w:cstheme="minorBidi"/>
+          <w:b/>
+          <w:bCs/>
+          <w:sz w:val="18"/>
+          <w:szCs w:val="18"/>
+        </w:rPr>
+        <w:t>SOL &amp; LUNA MALABRIGO CAMPO CLUB</w:t>
+      </w:r>
+      <w:r>
+        <w:rPr>
+          <w:rFonts w:asciiTheme="minorBidi" w:hAnsiTheme="minorBidi" w:cstheme="minorBidi"/>
+          <w:b/>
+          <w:bCs/>
+          <w:sz w:val="18"/>
+          <w:szCs w:val="18"/>
+        </w:rPr>
+        <w:t>”</w:t>
+      </w:r>
+      <w:r>
+        <w:rPr>
+          <w:rFonts w:asciiTheme="minorBidi" w:hAnsiTheme="minorBidi" w:cstheme="minorBidi"/>
+          <w:sz w:val="18"/>
+          <w:szCs w:val="18"/>
+        </w:rPr>
+        <w:t xml:space="preserve">, </w:t>
+      </w:r>
+      <w:r>
+        <w:rPr>
+          <w:rFonts w:asciiTheme="minorBidi" w:hAnsiTheme="minorBidi" w:cstheme="minorBidi"/>
+          <w:sz w:val="18"/>
+          <w:szCs w:val="18"/>
+        </w:rPr>
+        <w:t>CUYAS</w:t>
+      </w:r>
+      <w:r>
+        <w:rPr>
+          <w:rFonts w:asciiTheme="minorBidi" w:hAnsiTheme="minorBidi" w:cstheme="minorBidi"/>
+          <w:sz w:val="18"/>
+          <w:szCs w:val="18"/>
+        </w:rPr>
+        <w:t xml:space="preserve"> CARACTERISTICAS ESTAN SEÑALADAS EN LA MEMORIA DESCRIPTIVA </w:t>
+      </w:r>
+      <w:r>
+        <w:rPr>
+          <w:rFonts w:asciiTheme="minorBidi" w:hAnsiTheme="minorBidi" w:cstheme="minorBidi"/>
+          <w:sz w:val="18"/>
+          <w:szCs w:val="18"/>
+        </w:rPr>
+        <w:t xml:space="preserve">AL CUAL TIENE LIBRE ACCESO </w:t>
+      </w:r>
+      <w:r>
+        <w:rPr>
+          <w:rFonts w:asciiTheme="minorBidi" w:hAnsiTheme="minorBidi" w:cstheme="minorBidi"/>
+          <w:b/>
+          <w:bCs/>
+          <w:sz w:val="18"/>
+          <w:szCs w:val="18"/>
+        </w:rPr>
+        <w:t>«</w:t>
+      </w:r>
+      <w:r>
+        <w:rPr>
+          <w:rFonts w:asciiTheme="minorBidi" w:hAnsiTheme="minorBidi" w:cstheme="minorBidi"/>
+          <w:b/>
+          <w:bCs/>
+          <w:sz w:val="18"/>
+          <w:szCs w:val="18"/>
+        </w:rPr>
+        <w:t>COMPRADOR</w:t>
+      </w:r>
+      <w:r>
+        <w:rPr>
+          <w:rFonts w:asciiTheme="minorBidi" w:hAnsiTheme="minorBidi" w:cstheme="minorBidi"/>
+          <w:b/>
+          <w:bCs/>
+          <w:sz w:val="18"/>
+          <w:szCs w:val="18"/>
+        </w:rPr>
+        <w:t>»</w:t>
+      </w:r>
+      <w:r>
+        <w:rPr>
+          <w:rFonts w:asciiTheme="minorBidi" w:hAnsiTheme="minorBidi" w:cstheme="minorBidi"/>
+          <w:sz w:val="18"/>
+          <w:szCs w:val="18"/>
+        </w:rPr>
+        <w:t xml:space="preserve">; QUE ES MATERIA DE VENTA COMO BIEN FUTURO, Y QUE EN ADELANTE SERÁ DENOMINADO COMO </w:t>
+      </w:r>
+      <w:r>
+        <w:rPr>
+          <w:rFonts w:asciiTheme="minorBidi" w:hAnsiTheme="minorBidi" w:cstheme="minorBidi"/>
+          <w:b/>
+          <w:bCs/>
+          <w:sz w:val="18"/>
+          <w:szCs w:val="18"/>
+        </w:rPr>
+        <w:t>EL INMUEBLE</w:t>
+      </w:r>
+      <w:r>
+        <w:rPr>
+          <w:rFonts w:asciiTheme="minorBidi" w:hAnsiTheme="minorBidi" w:cstheme="minorBidi"/>
+          <w:sz w:val="18"/>
+          <w:szCs w:val="18"/>
+        </w:rPr>
+        <w:t>.</w:t>
+      </w:r>
+      <w:r>
+        <w:rPr>
+          <w:rFonts w:asciiTheme="minorBidi" w:hAnsiTheme="minorBidi" w:cstheme="minorBidi"/>
+          <w:sz w:val="18"/>
+          <w:szCs w:val="18"/>
+        </w:rPr>
+        <w:t xml:space="preserve"> </w:t>
       </w:r>
     </w:p>
     <w:p>
       <w:pPr>
         <w:pStyle w:val="NormalWeb"/>
-        <w:spacing w:before="0" w:beforeAutospacing="0" w:after="0" w:afterAutospacing="0" w:line="336" w:lineRule="auto"/>
+        <w:spacing w:before="0" w:beforeAutospacing="0" w:after="0" w:afterAutospacing="0" w:line="324" w:lineRule="auto"/>
         <w:jc w:val="both"/>
         <w:rPr>
           <w:rFonts w:asciiTheme="minorBidi" w:hAnsiTheme="minorBidi" w:cstheme="minorBidi"/>
@@ -1550,12 +858,812 @@
           <w:sz w:val="18"/>
           <w:szCs w:val="18"/>
         </w:rPr>
-        <w:t xml:space="preserve">AMBAS PARTES CONTRATANTES DECLARAN QUE EL PRECIO DE VENTA ES EL JUSTO Y LEGAL QUE LE CORRESPONDE A DICHO INMUEBLE, Y QUE SI ALGUNA DIFERENCIA DE MAS O DE MENOS EXISTIERA SE HACEN MUTUA Y RECIPROCA DONACION DEL EXCESO, DECLARANDO ASIMISMO QUE EN EL PRESENTE CONTRATO NO HA MEDIADO DOLO, ERROR, VIOLENCIA, INTIMIDACION NI CUALQUIER OTRO VICIO QUE LO INVALIDE. </w:t>
+        <w:t>AMBAS PARTES CELEBRAN ESTE CONTRATO DE COMPRAVENTA DE BIEN FUTURO, CONFORME A LO ESTABLECIDO POR EL ARTÍCULO 1534</w:t>
+      </w:r>
+      <w:r>
+        <w:rPr>
+          <w:rFonts w:asciiTheme="minorBidi" w:hAnsiTheme="minorBidi" w:cstheme="minorBidi"/>
+          <w:sz w:val="18"/>
+          <w:szCs w:val="18"/>
+        </w:rPr>
+        <w:t>°</w:t>
+      </w:r>
+      <w:r>
+        <w:rPr>
+          <w:rFonts w:asciiTheme="minorBidi" w:hAnsiTheme="minorBidi" w:cstheme="minorBidi"/>
+          <w:sz w:val="18"/>
+          <w:szCs w:val="18"/>
+        </w:rPr>
+        <w:t xml:space="preserve"> DEL CÓDIGO CIVIL, RESPECTO DE EL INMUEBLE ANTES MENCIONADO, EL MISMO QUE SERA</w:t>
+      </w:r>
+      <w:r>
+        <w:rPr>
+          <w:rFonts w:asciiTheme="minorBidi" w:hAnsiTheme="minorBidi" w:cstheme="minorBidi"/>
+          <w:sz w:val="18"/>
+          <w:szCs w:val="18"/>
+        </w:rPr>
+        <w:t xml:space="preserve"> </w:t>
+      </w:r>
+      <w:r>
+        <w:rPr>
+          <w:rFonts w:asciiTheme="minorBidi" w:hAnsiTheme="minorBidi" w:cstheme="minorBidi"/>
+          <w:sz w:val="18"/>
+          <w:szCs w:val="18"/>
+        </w:rPr>
+        <w:t>UN LOTE</w:t>
+      </w:r>
+      <w:r>
+        <w:rPr>
+          <w:rFonts w:asciiTheme="minorBidi" w:hAnsiTheme="minorBidi" w:cstheme="minorBidi"/>
+          <w:sz w:val="18"/>
+          <w:szCs w:val="18"/>
+        </w:rPr>
+        <w:t xml:space="preserve"> </w:t>
+      </w:r>
+      <w:r>
+        <w:rPr>
+          <w:rFonts w:asciiTheme="minorBidi" w:hAnsiTheme="minorBidi" w:cstheme="minorBidi"/>
+          <w:sz w:val="18"/>
+          <w:szCs w:val="18"/>
+        </w:rPr>
+        <w:t>D</w:t>
+      </w:r>
+      <w:r>
+        <w:rPr>
+          <w:rFonts w:asciiTheme="minorBidi" w:hAnsiTheme="minorBidi" w:cstheme="minorBidi"/>
+          <w:sz w:val="18"/>
+          <w:szCs w:val="18"/>
+        </w:rPr>
+        <w:t>EL PREDIO MATRIZ</w:t>
+      </w:r>
+      <w:r>
+        <w:rPr>
+          <w:rFonts w:asciiTheme="minorBidi" w:hAnsiTheme="minorBidi" w:cstheme="minorBidi"/>
+          <w:sz w:val="18"/>
+          <w:szCs w:val="18"/>
+        </w:rPr>
+        <w:t xml:space="preserve"> </w:t>
+      </w:r>
+      <w:r>
+        <w:rPr>
+          <w:rFonts w:asciiTheme="minorBidi" w:hAnsiTheme="minorBidi" w:cstheme="minorBidi"/>
+          <w:sz w:val="18"/>
+          <w:szCs w:val="18"/>
+        </w:rPr>
+        <w:t>DESCRITO</w:t>
+      </w:r>
+      <w:r>
+        <w:rPr>
+          <w:rFonts w:asciiTheme="minorBidi" w:hAnsiTheme="minorBidi" w:cstheme="minorBidi"/>
+          <w:sz w:val="18"/>
+          <w:szCs w:val="18"/>
+        </w:rPr>
+        <w:t xml:space="preserve"> </w:t>
+      </w:r>
+      <w:r>
+        <w:rPr>
+          <w:rFonts w:asciiTheme="minorBidi" w:hAnsiTheme="minorBidi" w:cstheme="minorBidi"/>
+          <w:sz w:val="18"/>
+          <w:szCs w:val="18"/>
+        </w:rPr>
+        <w:t>EN</w:t>
+      </w:r>
+      <w:r>
+        <w:rPr>
+          <w:rFonts w:asciiTheme="minorBidi" w:hAnsiTheme="minorBidi" w:cstheme="minorBidi"/>
+          <w:sz w:val="18"/>
+          <w:szCs w:val="18"/>
+        </w:rPr>
+        <w:t xml:space="preserve"> </w:t>
+      </w:r>
+      <w:r>
+        <w:rPr>
+          <w:rFonts w:asciiTheme="minorBidi" w:hAnsiTheme="minorBidi" w:cstheme="minorBidi"/>
+          <w:sz w:val="18"/>
+          <w:szCs w:val="18"/>
+        </w:rPr>
+        <w:t>EL PRIMER</w:t>
+      </w:r>
+      <w:r>
+        <w:rPr>
+          <w:rFonts w:asciiTheme="minorBidi" w:hAnsiTheme="minorBidi" w:cstheme="minorBidi"/>
+          <w:sz w:val="18"/>
+          <w:szCs w:val="18"/>
+        </w:rPr>
+        <w:t xml:space="preserve"> </w:t>
+      </w:r>
+      <w:r>
+        <w:rPr>
+          <w:rFonts w:asciiTheme="minorBidi" w:hAnsiTheme="minorBidi" w:cstheme="minorBidi"/>
+          <w:sz w:val="18"/>
+          <w:szCs w:val="18"/>
+        </w:rPr>
+        <w:t>PARRAFO</w:t>
+      </w:r>
+      <w:r>
+        <w:rPr>
+          <w:rFonts w:asciiTheme="minorBidi" w:hAnsiTheme="minorBidi" w:cstheme="minorBidi"/>
+          <w:sz w:val="18"/>
+          <w:szCs w:val="18"/>
+        </w:rPr>
+        <w:t xml:space="preserve"> </w:t>
+      </w:r>
+      <w:r>
+        <w:rPr>
+          <w:rFonts w:asciiTheme="minorBidi" w:hAnsiTheme="minorBidi" w:cstheme="minorBidi"/>
+          <w:sz w:val="18"/>
+          <w:szCs w:val="18"/>
+        </w:rPr>
+        <w:t>DE LA PRESENTE CLAUSULA.</w:t>
+      </w:r>
+      <w:r>
+        <w:rPr>
+          <w:rFonts w:asciiTheme="minorBidi" w:hAnsiTheme="minorBidi" w:cstheme="minorBidi"/>
+          <w:sz w:val="18"/>
+          <w:szCs w:val="18"/>
+        </w:rPr>
+        <w:t xml:space="preserve"> </w:t>
       </w:r>
     </w:p>
     <w:p>
       <w:pPr>
-        <w:spacing w:line="336" w:lineRule="auto"/>
+        <w:pStyle w:val="NormalWeb"/>
+        <w:spacing w:before="0" w:beforeAutospacing="0" w:after="0" w:afterAutospacing="0" w:line="324" w:lineRule="auto"/>
+        <w:jc w:val="both"/>
+        <w:rPr>
+          <w:rFonts w:asciiTheme="minorBidi" w:hAnsiTheme="minorBidi" w:cstheme="minorBidi"/>
+          <w:sz w:val="18"/>
+          <w:szCs w:val="18"/>
+        </w:rPr>
+      </w:pPr>
+      <w:proofErr w:type="gramStart"/>
+      <w:r>
+        <w:rPr>
+          <w:rFonts w:asciiTheme="minorBidi" w:hAnsiTheme="minorBidi" w:cstheme="minorBidi"/>
+          <w:b/>
+          <w:bCs/>
+          <w:sz w:val="18"/>
+          <w:szCs w:val="18"/>
+        </w:rPr>
+        <w:t>SEGUNDA</w:t>
+      </w:r>
+      <w:r>
+        <w:rPr>
+          <w:rFonts w:asciiTheme="minorBidi" w:hAnsiTheme="minorBidi" w:cstheme="minorBidi"/>
+          <w:sz w:val="18"/>
+          <w:szCs w:val="18"/>
+        </w:rPr>
+        <w:t>.-</w:t>
+      </w:r>
+      <w:proofErr w:type="gramEnd"/>
+      <w:r>
+        <w:rPr>
+          <w:rFonts w:asciiTheme="minorBidi" w:hAnsiTheme="minorBidi" w:cstheme="minorBidi"/>
+          <w:sz w:val="18"/>
+          <w:szCs w:val="18"/>
+        </w:rPr>
+        <w:t xml:space="preserve"> SOBRE LA CELEBRACIÓN DEL CONTRATO PREPARATORIO DE COMPRAVENTA DE BIEN FUTURO.</w:t>
+      </w:r>
+      <w:r>
+        <w:rPr>
+          <w:rFonts w:asciiTheme="minorBidi" w:hAnsiTheme="minorBidi" w:cstheme="minorBidi"/>
+          <w:sz w:val="18"/>
+          <w:szCs w:val="18"/>
+        </w:rPr>
+        <w:t xml:space="preserve"> </w:t>
+      </w:r>
+    </w:p>
+    <w:p>
+      <w:pPr>
+        <w:pStyle w:val="NormalWeb"/>
+        <w:spacing w:before="0" w:beforeAutospacing="0" w:after="0" w:afterAutospacing="0" w:line="324" w:lineRule="auto"/>
+        <w:jc w:val="both"/>
+        <w:rPr>
+          <w:rFonts w:asciiTheme="minorBidi" w:hAnsiTheme="minorBidi" w:cstheme="minorBidi"/>
+          <w:sz w:val="18"/>
+          <w:szCs w:val="18"/>
+        </w:rPr>
+      </w:pPr>
+      <w:r>
+        <w:rPr>
+          <w:rFonts w:asciiTheme="minorBidi" w:hAnsiTheme="minorBidi" w:cstheme="minorBidi"/>
+          <w:sz w:val="18"/>
+          <w:szCs w:val="18"/>
+        </w:rPr>
+        <w:t xml:space="preserve">LAS PARTES RECONOCEN Y DECLARAN QUE </w:t>
+      </w:r>
+      <w:r>
+        <w:rPr>
+          <w:rFonts w:asciiTheme="minorBidi" w:hAnsiTheme="minorBidi" w:cstheme="minorBidi"/>
+          <w:sz w:val="18"/>
+          <w:szCs w:val="18"/>
+        </w:rPr>
+        <w:t>ANTERIOR A ESTA MINUTA,</w:t>
+      </w:r>
+      <w:r>
+        <w:rPr>
+          <w:rFonts w:asciiTheme="minorBidi" w:hAnsiTheme="minorBidi" w:cstheme="minorBidi"/>
+          <w:sz w:val="18"/>
+          <w:szCs w:val="18"/>
+        </w:rPr>
+        <w:t xml:space="preserve"> CELEBRARON Y SUSCRIBIERON UN CONTRATO </w:t>
+      </w:r>
+      <w:r>
+        <w:rPr>
+          <w:rFonts w:asciiTheme="minorBidi" w:hAnsiTheme="minorBidi" w:cstheme="minorBidi"/>
+          <w:sz w:val="18"/>
+          <w:szCs w:val="18"/>
+        </w:rPr>
+        <w:t>DE PROMESA DE VENTA</w:t>
+      </w:r>
+      <w:r>
+        <w:rPr>
+          <w:rFonts w:asciiTheme="minorBidi" w:hAnsiTheme="minorBidi" w:cstheme="minorBidi"/>
+          <w:sz w:val="18"/>
+          <w:szCs w:val="18"/>
+        </w:rPr>
+        <w:t xml:space="preserve">, EN CONSECUENCIA, CON LA CELEBRACION DEL PRESENTE CONTRATO DEFINITIVO DE COMPRAVENTA, DENTRO DEL PLAZO PACTADO, SE ESTA CUMPLIENDO CON LOS COMPROMISOS Y ACUERDOS CONTENIDOS EN EL MENCIONADO CONTRATO </w:t>
+      </w:r>
+      <w:r>
+        <w:rPr>
+          <w:rFonts w:asciiTheme="minorBidi" w:hAnsiTheme="minorBidi" w:cstheme="minorBidi"/>
+          <w:sz w:val="18"/>
+          <w:szCs w:val="18"/>
+        </w:rPr>
+        <w:t>PRIVADO DE PROMESA DE VENTA</w:t>
+      </w:r>
+      <w:r>
+        <w:rPr>
+          <w:rFonts w:asciiTheme="minorBidi" w:hAnsiTheme="minorBidi" w:cstheme="minorBidi"/>
+          <w:sz w:val="18"/>
+          <w:szCs w:val="18"/>
+        </w:rPr>
+        <w:t>.</w:t>
+      </w:r>
+      <w:r>
+        <w:rPr>
+          <w:rFonts w:asciiTheme="minorBidi" w:hAnsiTheme="minorBidi" w:cstheme="minorBidi"/>
+          <w:sz w:val="18"/>
+          <w:szCs w:val="18"/>
+        </w:rPr>
+        <w:t xml:space="preserve"> </w:t>
+      </w:r>
+    </w:p>
+    <w:p>
+      <w:pPr>
+        <w:pStyle w:val="NormalWeb"/>
+        <w:spacing w:before="0" w:beforeAutospacing="0" w:after="0" w:afterAutospacing="0" w:line="324" w:lineRule="auto"/>
+        <w:jc w:val="both"/>
+        <w:rPr>
+          <w:rFonts w:asciiTheme="minorBidi" w:hAnsiTheme="minorBidi" w:cstheme="minorBidi"/>
+          <w:sz w:val="18"/>
+          <w:szCs w:val="18"/>
+        </w:rPr>
+      </w:pPr>
+      <w:r>
+        <w:rPr>
+          <w:rFonts w:asciiTheme="minorBidi" w:hAnsiTheme="minorBidi" w:cstheme="minorBidi"/>
+          <w:sz w:val="18"/>
+          <w:szCs w:val="18"/>
+        </w:rPr>
+        <w:t xml:space="preserve">ASIMISMO, LAS PARTES RECONOCEN Y DECLARAN QUE EN CASO DE DISCREPANCIA O DISCONFORMIDAD ENTRE LOS ACUERDOS ADOPTADOS EN EL CONTRATO </w:t>
+      </w:r>
+      <w:r>
+        <w:rPr>
+          <w:rFonts w:asciiTheme="minorBidi" w:hAnsiTheme="minorBidi" w:cstheme="minorBidi"/>
+          <w:sz w:val="18"/>
+          <w:szCs w:val="18"/>
+        </w:rPr>
+        <w:t>PRIVADO</w:t>
+      </w:r>
+      <w:r>
+        <w:rPr>
+          <w:rFonts w:asciiTheme="minorBidi" w:hAnsiTheme="minorBidi" w:cstheme="minorBidi"/>
+          <w:sz w:val="18"/>
+          <w:szCs w:val="18"/>
+        </w:rPr>
+        <w:t xml:space="preserve"> Y EL PRESENTE CONTRATO DEFINITIVO, PREVALECEN LOS ACUERDOS DEL CONTRATO DEFINITIVO.</w:t>
+      </w:r>
+      <w:r>
+        <w:rPr>
+          <w:rFonts w:asciiTheme="minorBidi" w:hAnsiTheme="minorBidi" w:cstheme="minorBidi"/>
+          <w:sz w:val="18"/>
+          <w:szCs w:val="18"/>
+        </w:rPr>
+        <w:t xml:space="preserve"> </w:t>
+      </w:r>
+    </w:p>
+    <w:p>
+      <w:pPr>
+        <w:pStyle w:val="NormalWeb"/>
+        <w:spacing w:before="0" w:beforeAutospacing="0" w:after="0" w:afterAutospacing="0" w:line="324" w:lineRule="auto"/>
+        <w:jc w:val="both"/>
+        <w:rPr>
+          <w:rFonts w:asciiTheme="minorBidi" w:hAnsiTheme="minorBidi" w:cstheme="minorBidi"/>
+          <w:sz w:val="18"/>
+          <w:szCs w:val="18"/>
+        </w:rPr>
+      </w:pPr>
+      <w:proofErr w:type="gramStart"/>
+      <w:r>
+        <w:rPr>
+          <w:rFonts w:asciiTheme="minorBidi" w:hAnsiTheme="minorBidi" w:cstheme="minorBidi"/>
+          <w:b/>
+          <w:bCs/>
+          <w:sz w:val="18"/>
+          <w:szCs w:val="18"/>
+        </w:rPr>
+        <w:t>TERCERA</w:t>
+      </w:r>
+      <w:r>
+        <w:rPr>
+          <w:rFonts w:asciiTheme="minorBidi" w:hAnsiTheme="minorBidi" w:cstheme="minorBidi"/>
+          <w:sz w:val="18"/>
+          <w:szCs w:val="18"/>
+        </w:rPr>
+        <w:t>.-</w:t>
+      </w:r>
+      <w:proofErr w:type="gramEnd"/>
+      <w:r>
+        <w:rPr>
+          <w:rFonts w:asciiTheme="minorBidi" w:hAnsiTheme="minorBidi" w:cstheme="minorBidi"/>
+          <w:sz w:val="18"/>
+          <w:szCs w:val="18"/>
+        </w:rPr>
+        <w:t xml:space="preserve"> IMPORTE DE VENTA Y FORMA DE PAGO</w:t>
+      </w:r>
+      <w:r>
+        <w:rPr>
+          <w:rFonts w:asciiTheme="minorBidi" w:hAnsiTheme="minorBidi" w:cstheme="minorBidi"/>
+          <w:sz w:val="18"/>
+          <w:szCs w:val="18"/>
+        </w:rPr>
+        <w:t xml:space="preserve">: </w:t>
+      </w:r>
+    </w:p>
+    <w:p>
+      <w:pPr>
+        <w:pStyle w:val="NormalWeb"/>
+        <w:spacing w:before="0" w:beforeAutospacing="0" w:after="0" w:afterAutospacing="0" w:line="324" w:lineRule="auto"/>
+        <w:jc w:val="both"/>
+        <w:rPr>
+          <w:rFonts w:asciiTheme="minorBidi" w:hAnsiTheme="minorBidi" w:cstheme="minorBidi"/>
+          <w:sz w:val="18"/>
+          <w:szCs w:val="18"/>
+        </w:rPr>
+      </w:pPr>
+      <w:r>
+        <w:rPr>
+          <w:rFonts w:asciiTheme="minorBidi" w:hAnsiTheme="minorBidi" w:cstheme="minorBidi"/>
+          <w:sz w:val="18"/>
+          <w:szCs w:val="18"/>
+        </w:rPr>
+        <w:t xml:space="preserve">POR INTERMEDIO DEL PRESENTE CONTRATO, </w:t>
+      </w:r>
+      <w:r>
+        <w:rPr>
+          <w:rFonts w:asciiTheme="minorBidi" w:hAnsiTheme="minorBidi" w:cstheme="minorBidi"/>
+          <w:b/>
+          <w:bCs/>
+          <w:sz w:val="18"/>
+          <w:szCs w:val="18"/>
+        </w:rPr>
+        <w:t>LA VENDEDORA</w:t>
+      </w:r>
+      <w:r>
+        <w:rPr>
+          <w:rFonts w:asciiTheme="minorBidi" w:hAnsiTheme="minorBidi" w:cstheme="minorBidi"/>
+          <w:sz w:val="18"/>
+          <w:szCs w:val="18"/>
+        </w:rPr>
+        <w:t>, TRANSFIERE, EN VENTA REAL Y ENAJENACION PERPETUA</w:t>
+      </w:r>
+      <w:r>
+        <w:rPr>
+          <w:rFonts w:asciiTheme="minorBidi" w:hAnsiTheme="minorBidi" w:cstheme="minorBidi"/>
+          <w:sz w:val="18"/>
+          <w:szCs w:val="18"/>
+        </w:rPr>
+        <w:t xml:space="preserve">, EL </w:t>
+      </w:r>
+      <w:r>
+        <w:rPr>
+          <w:rFonts w:asciiTheme="minorBidi" w:hAnsiTheme="minorBidi" w:cstheme="minorBidi"/>
+          <w:b/>
+          <w:bCs/>
+          <w:sz w:val="18"/>
+          <w:szCs w:val="18"/>
+        </w:rPr>
+        <w:t xml:space="preserve">LOTE «LOTE», </w:t>
+      </w:r>
+      <w:r>
+        <w:rPr>
+          <w:rFonts w:asciiTheme="minorBidi" w:hAnsiTheme="minorBidi" w:cstheme="minorBidi"/>
+          <w:sz w:val="18"/>
+          <w:szCs w:val="18"/>
+        </w:rPr>
+        <w:t xml:space="preserve">DE LA </w:t>
+      </w:r>
+      <w:r>
+        <w:rPr>
+          <w:rFonts w:asciiTheme="minorBidi" w:hAnsiTheme="minorBidi" w:cstheme="minorBidi"/>
+          <w:b/>
+          <w:bCs/>
+          <w:sz w:val="18"/>
+          <w:szCs w:val="18"/>
+        </w:rPr>
+        <w:t xml:space="preserve">MANZANA «MZ», </w:t>
+      </w:r>
+      <w:r>
+        <w:rPr>
+          <w:rFonts w:asciiTheme="minorBidi" w:hAnsiTheme="minorBidi" w:cstheme="minorBidi"/>
+          <w:sz w:val="18"/>
+          <w:szCs w:val="18"/>
+        </w:rPr>
+        <w:t xml:space="preserve">CON UN AREA DE </w:t>
+      </w:r>
+      <w:r>
+        <w:rPr>
+          <w:rFonts w:asciiTheme="minorBidi" w:hAnsiTheme="minorBidi" w:cstheme="minorBidi"/>
+          <w:b/>
+          <w:bCs/>
+          <w:sz w:val="18"/>
+          <w:szCs w:val="18"/>
+        </w:rPr>
+        <w:t xml:space="preserve">«AREA» M2 («AREA_TEXTO» METROS CUADRADOS) </w:t>
+      </w:r>
+      <w:r>
+        <w:rPr>
+          <w:rFonts w:asciiTheme="minorBidi" w:hAnsiTheme="minorBidi" w:cstheme="minorBidi"/>
+          <w:sz w:val="18"/>
+          <w:szCs w:val="18"/>
+        </w:rPr>
+        <w:t xml:space="preserve">DEL PROYECTO DENOMINADO </w:t>
+      </w:r>
+      <w:r>
+        <w:rPr>
+          <w:rFonts w:asciiTheme="minorBidi" w:hAnsiTheme="minorBidi" w:cstheme="minorBidi"/>
+          <w:b/>
+          <w:bCs/>
+          <w:sz w:val="18"/>
+          <w:szCs w:val="18"/>
+        </w:rPr>
+        <w:t>“</w:t>
+      </w:r>
+      <w:r>
+        <w:rPr>
+          <w:rFonts w:asciiTheme="minorBidi" w:hAnsiTheme="minorBidi" w:cstheme="minorBidi"/>
+          <w:b/>
+          <w:bCs/>
+          <w:sz w:val="18"/>
+          <w:szCs w:val="18"/>
+        </w:rPr>
+        <w:t>SOL &amp; LUNA MALABRIGO CAMPO CLUB</w:t>
+      </w:r>
+      <w:r>
+        <w:rPr>
+          <w:rFonts w:asciiTheme="minorBidi" w:hAnsiTheme="minorBidi" w:cstheme="minorBidi"/>
+          <w:b/>
+          <w:bCs/>
+          <w:sz w:val="18"/>
+          <w:szCs w:val="18"/>
+        </w:rPr>
+        <w:t>”</w:t>
+      </w:r>
+      <w:r>
+        <w:rPr>
+          <w:rFonts w:asciiTheme="minorBidi" w:hAnsiTheme="minorBidi" w:cstheme="minorBidi"/>
+          <w:sz w:val="18"/>
+          <w:szCs w:val="18"/>
+        </w:rPr>
+        <w:t xml:space="preserve"> A FAVOR DE </w:t>
+      </w:r>
+      <w:r>
+        <w:rPr>
+          <w:rFonts w:asciiTheme="minorBidi" w:hAnsiTheme="minorBidi" w:cstheme="minorBidi"/>
+          <w:b/>
+          <w:bCs/>
+          <w:sz w:val="18"/>
+          <w:szCs w:val="18"/>
+        </w:rPr>
+        <w:t>«</w:t>
+      </w:r>
+      <w:r>
+        <w:rPr>
+          <w:rFonts w:asciiTheme="minorBidi" w:hAnsiTheme="minorBidi" w:cstheme="minorBidi"/>
+          <w:b/>
+          <w:bCs/>
+          <w:sz w:val="18"/>
+          <w:szCs w:val="18"/>
+        </w:rPr>
+        <w:t>COMPRADOR</w:t>
+      </w:r>
+      <w:r>
+        <w:rPr>
+          <w:rFonts w:asciiTheme="minorBidi" w:hAnsiTheme="minorBidi" w:cstheme="minorBidi"/>
+          <w:b/>
+          <w:bCs/>
+          <w:sz w:val="18"/>
+          <w:szCs w:val="18"/>
+        </w:rPr>
+        <w:t>»</w:t>
+      </w:r>
+      <w:r>
+        <w:rPr>
+          <w:rFonts w:asciiTheme="minorBidi" w:hAnsiTheme="minorBidi" w:cstheme="minorBidi"/>
+          <w:sz w:val="18"/>
+          <w:szCs w:val="18"/>
+        </w:rPr>
+        <w:t xml:space="preserve">, POR LA SUMA TOTAL DE </w:t>
+      </w:r>
+      <w:r>
+        <w:rPr>
+          <w:rFonts w:asciiTheme="minorBidi" w:hAnsiTheme="minorBidi" w:cstheme="minorBidi"/>
+          <w:b/>
+          <w:sz w:val="18"/>
+          <w:szCs w:val="18"/>
+        </w:rPr>
+        <w:t>S</w:t>
+      </w:r>
+      <w:proofErr w:type="gramStart"/>
+      <w:r>
+        <w:rPr>
+          <w:rFonts w:asciiTheme="minorBidi" w:hAnsiTheme="minorBidi" w:cstheme="minorBidi"/>
+          <w:b/>
+          <w:sz w:val="18"/>
+          <w:szCs w:val="18"/>
+        </w:rPr>
+        <w:t>/«</w:t>
+      </w:r>
+      <w:proofErr w:type="gramEnd"/>
+      <w:r>
+        <w:rPr>
+          <w:rFonts w:asciiTheme="minorBidi" w:hAnsiTheme="minorBidi" w:cstheme="minorBidi"/>
+          <w:b/>
+          <w:sz w:val="18"/>
+          <w:szCs w:val="18"/>
+        </w:rPr>
+        <w:t>PRECIO»(«PRECIO_TEXTO» Y «PRECIO_DECIMAL»/100 SOLES)</w:t>
+      </w:r>
+      <w:r>
+        <w:rPr>
+          <w:rFonts w:asciiTheme="minorBidi" w:hAnsiTheme="minorBidi" w:cstheme="minorBidi"/>
+          <w:sz w:val="18"/>
+          <w:szCs w:val="18"/>
+        </w:rPr>
+        <w:t>.</w:t>
+      </w:r>
+      <w:r>
+        <w:rPr>
+          <w:rFonts w:asciiTheme="minorBidi" w:hAnsiTheme="minorBidi" w:cstheme="minorBidi"/>
+          <w:sz w:val="18"/>
+          <w:szCs w:val="18"/>
+        </w:rPr>
+        <w:t xml:space="preserve"> </w:t>
+      </w:r>
+    </w:p>
+    <w:p>
+      <w:pPr>
+        <w:pStyle w:val="NormalWeb"/>
+        <w:spacing w:before="0" w:beforeAutospacing="0" w:after="0" w:afterAutospacing="0" w:line="324" w:lineRule="auto"/>
+        <w:jc w:val="both"/>
+        <w:rPr>
+          <w:rFonts w:asciiTheme="minorBidi" w:hAnsiTheme="minorBidi" w:cstheme="minorBidi"/>
+          <w:sz w:val="18"/>
+          <w:szCs w:val="18"/>
+        </w:rPr>
+      </w:pPr>
+      <w:r>
+        <w:rPr>
+          <w:rFonts w:asciiTheme="minorBidi" w:hAnsiTheme="minorBidi" w:cstheme="minorBidi"/>
+          <w:sz w:val="18"/>
+          <w:szCs w:val="18"/>
+        </w:rPr>
+        <w:lastRenderedPageBreak/>
+        <w:t xml:space="preserve">LA PRESENTE COMPRAVENTA SE ENCUENTRA SUJETA A LA CONDICIÓN SUSPENSIVA QUE DICHO INMUEBLE LLEGUE A INDEPENDIZARSE, Y TRATANDOSE DE BIEN FUTURO, EL PRECIO TOTAL ANTES INDICADO, SE CANCELARA DE LA SIGUIENTE MANERA: </w:t>
+      </w:r>
+    </w:p>
+    <w:p>
+      <w:pPr>
+        <w:pStyle w:val="NormalWeb"/>
+        <w:spacing w:before="0" w:beforeAutospacing="0" w:after="0" w:afterAutospacing="0" w:line="324" w:lineRule="auto"/>
+        <w:jc w:val="both"/>
+        <w:rPr>
+          <w:rFonts w:asciiTheme="minorBidi" w:hAnsiTheme="minorBidi" w:cstheme="minorBidi"/>
+          <w:sz w:val="18"/>
+          <w:szCs w:val="18"/>
+        </w:rPr>
+      </w:pPr>
+      <w:r>
+        <w:rPr>
+          <w:rFonts w:asciiTheme="minorBidi" w:hAnsiTheme="minorBidi" w:cstheme="minorBidi"/>
+          <w:sz w:val="18"/>
+          <w:szCs w:val="18"/>
+        </w:rPr>
+        <w:t xml:space="preserve">3.1.- EL IMPORTE DE </w:t>
+      </w:r>
+      <w:r>
+        <w:rPr>
+          <w:rFonts w:asciiTheme="minorBidi" w:hAnsiTheme="minorBidi" w:cstheme="minorBidi"/>
+          <w:b/>
+          <w:bCs/>
+          <w:sz w:val="18"/>
+          <w:szCs w:val="18"/>
+        </w:rPr>
+        <w:t>S</w:t>
+      </w:r>
+      <w:proofErr w:type="gramStart"/>
+      <w:r>
+        <w:rPr>
+          <w:rFonts w:asciiTheme="minorBidi" w:hAnsiTheme="minorBidi" w:cstheme="minorBidi"/>
+          <w:b/>
+          <w:bCs/>
+          <w:sz w:val="18"/>
+          <w:szCs w:val="18"/>
+        </w:rPr>
+        <w:t>/«</w:t>
+      </w:r>
+      <w:proofErr w:type="gramEnd"/>
+      <w:r>
+        <w:rPr>
+          <w:rFonts w:asciiTheme="minorBidi" w:hAnsiTheme="minorBidi" w:cstheme="minorBidi"/>
+          <w:b/>
+          <w:bCs/>
+          <w:sz w:val="18"/>
+          <w:szCs w:val="18"/>
+        </w:rPr>
+        <w:t>PAGO»(«PAGO_TEXTO» Y «PAGO_DECIMAL»/100 SOLES)</w:t>
+      </w:r>
+      <w:r>
+        <w:rPr>
+          <w:rFonts w:asciiTheme="minorBidi" w:hAnsiTheme="minorBidi" w:cstheme="minorBidi"/>
+          <w:sz w:val="18"/>
+          <w:szCs w:val="18"/>
+        </w:rPr>
+        <w:t xml:space="preserve">, HAN SIDO CANCELADOS CON RECURSOS PROPIOS DE LOS COMPRADORES EN EL CUAL SE INCLUYE LA SUMA ENTREGADA POR LOS COMPRADORES A TITULO DE ARRAS AL MOMENTO DE LA CELEBRACION DEL CONTRATO PRIVADO DE PROMESA DE VENTA, DESCRITO EN LA CLAUSULA SEGUNDA, Y QUE LAS PARTES ACUERDAN QUE SEAN IMPUTADAS COMO PAGO DEL PRECIO DE VENTA. </w:t>
+      </w:r>
+    </w:p>
+    <w:p>
+      <w:pPr>
+        <w:pStyle w:val="NormalWeb"/>
+        <w:spacing w:before="0" w:beforeAutospacing="0" w:after="0" w:afterAutospacing="0" w:line="324" w:lineRule="auto"/>
+        <w:jc w:val="both"/>
+        <w:rPr>
+          <w:rFonts w:asciiTheme="minorBidi" w:hAnsiTheme="minorBidi" w:cstheme="minorBidi"/>
+          <w:sz w:val="18"/>
+          <w:szCs w:val="18"/>
+        </w:rPr>
+      </w:pPr>
+      <w:r>
+        <w:rPr>
+          <w:rFonts w:asciiTheme="minorBidi" w:hAnsiTheme="minorBidi" w:cstheme="minorBidi"/>
+          <w:sz w:val="18"/>
+          <w:szCs w:val="18"/>
+        </w:rPr>
+        <w:t xml:space="preserve">3.2- EL SALDO POR LA SUMA DE </w:t>
+      </w:r>
+      <w:r>
+        <w:rPr>
+          <w:rFonts w:asciiTheme="minorBidi" w:hAnsiTheme="minorBidi" w:cstheme="minorBidi"/>
+          <w:b/>
+          <w:sz w:val="18"/>
+          <w:szCs w:val="18"/>
+        </w:rPr>
+        <w:t>S</w:t>
+      </w:r>
+      <w:proofErr w:type="gramStart"/>
+      <w:r>
+        <w:rPr>
+          <w:rFonts w:asciiTheme="minorBidi" w:hAnsiTheme="minorBidi" w:cstheme="minorBidi"/>
+          <w:b/>
+          <w:sz w:val="18"/>
+          <w:szCs w:val="18"/>
+        </w:rPr>
+        <w:t>/«</w:t>
+      </w:r>
+      <w:proofErr w:type="gramEnd"/>
+      <w:r>
+        <w:rPr>
+          <w:rFonts w:asciiTheme="minorBidi" w:hAnsiTheme="minorBidi" w:cstheme="minorBidi"/>
+          <w:b/>
+          <w:sz w:val="18"/>
+          <w:szCs w:val="18"/>
+        </w:rPr>
+        <w:t>SALDO»(«</w:t>
+      </w:r>
+      <w:r>
+        <w:rPr>
+          <w:rFonts w:ascii="Arial" w:hAnsi="Arial" w:cs="Arial"/>
+          <w:b/>
+          <w:sz w:val="18"/>
+          <w:szCs w:val="18"/>
+        </w:rPr>
+        <w:t>SALDO_TEXTO» Y «SALDO_DECIMAL»/100 SOLES)</w:t>
+      </w:r>
+      <w:r>
+        <w:rPr>
+          <w:rFonts w:ascii="Arial" w:hAnsi="Arial" w:cs="Arial"/>
+          <w:sz w:val="18"/>
+          <w:szCs w:val="18"/>
+        </w:rPr>
+        <w:t xml:space="preserve"> SERAN CANCELADOS MEDIANTE DEPÓSITO BANCARIO, TRANSFERENCIA INTERBANCARIA, O CHEQUE DE GERENCIA, A FAVOR DE LA VENDEDORA, </w:t>
+      </w:r>
+      <w:r>
+        <w:rPr>
+          <w:rFonts w:ascii="Arial" w:hAnsi="Arial" w:cs="Arial"/>
+          <w:bCs/>
+          <w:sz w:val="18"/>
+          <w:szCs w:val="18"/>
+        </w:rPr>
+        <w:t xml:space="preserve">COMO PLAZO MAXIMO HASTA EL </w:t>
+      </w:r>
+      <w:r>
+        <w:rPr>
+          <w:rFonts w:ascii="Arial" w:hAnsi="Arial" w:cs="Arial"/>
+          <w:b/>
+          <w:sz w:val="18"/>
+          <w:szCs w:val="18"/>
+        </w:rPr>
+        <w:t>«</w:t>
+      </w:r>
+      <w:r>
+        <w:rPr>
+          <w:rFonts w:ascii="Arial" w:hAnsi="Arial" w:cs="Arial"/>
+          <w:b/>
+          <w:sz w:val="18"/>
+          <w:szCs w:val="18"/>
+        </w:rPr>
+        <w:t>FECHA_PAGO</w:t>
+      </w:r>
+      <w:r>
+        <w:rPr>
+          <w:rFonts w:ascii="Arial" w:hAnsi="Arial" w:cs="Arial"/>
+          <w:b/>
+          <w:sz w:val="18"/>
+          <w:szCs w:val="18"/>
+        </w:rPr>
+        <w:t>»</w:t>
+      </w:r>
+      <w:r>
+        <w:rPr>
+          <w:rFonts w:ascii="Arial" w:hAnsi="Arial" w:cs="Arial"/>
+          <w:sz w:val="18"/>
+          <w:szCs w:val="18"/>
+        </w:rPr>
+        <w:t>, SIENDO LA SOLA FIRMA POR PARTE DE LA VENDEDORA EN LA ESCRITURA PUBLICA QUE DE ORIGEN LA PRESENTE MINUTA DE COMPRAVENTA CONSTANCIA SUFICIENTE DE SU CANCELACION TOTAL DEL PRECIO</w:t>
+      </w:r>
+      <w:r>
+        <w:rPr>
+          <w:rFonts w:asciiTheme="minorBidi" w:hAnsiTheme="minorBidi" w:cstheme="minorBidi"/>
+          <w:sz w:val="18"/>
+          <w:szCs w:val="18"/>
+        </w:rPr>
+        <w:t xml:space="preserve"> DE VENTA. </w:t>
+      </w:r>
+    </w:p>
+    <w:p>
+      <w:pPr>
+        <w:pStyle w:val="NormalWeb"/>
+        <w:spacing w:before="0" w:beforeAutospacing="0" w:after="0" w:afterAutospacing="0" w:line="324" w:lineRule="auto"/>
+        <w:jc w:val="both"/>
+        <w:rPr>
+          <w:rFonts w:asciiTheme="minorBidi" w:hAnsiTheme="minorBidi" w:cstheme="minorBidi"/>
+          <w:sz w:val="18"/>
+          <w:szCs w:val="18"/>
+        </w:rPr>
+      </w:pPr>
+      <w:r>
+        <w:rPr>
+          <w:rFonts w:asciiTheme="minorBidi" w:hAnsiTheme="minorBidi" w:cstheme="minorBidi"/>
+          <w:sz w:val="18"/>
+          <w:szCs w:val="18"/>
+        </w:rPr>
+        <w:t xml:space="preserve">AMBAS PARTES CONTRATANTES DECLARAN QUE EL PRECIO DE VENTA ES EL JUSTO Y LEGAL QUE LE CORRESPONDE A DICHO INMUEBLE, Y QUE SI ALGUNA DIFERENCIA DE MAS O DE MENOS EXISTIERA SE HACEN MUTUA Y RECIPROCA DONACION DEL EXCESO, DECLARANDO ASIMISMO QUE EN EL PRESENTE CONTRATO NO HA MEDIADO DOLO, ERROR, VIOLENCIA, INTIMIDACION NI CUALQUIER OTRO VICIO QUE LO INVALIDE. </w:t>
+      </w:r>
+    </w:p>
+    <w:p>
+      <w:pPr>
+        <w:spacing w:line="324" w:lineRule="auto"/>
         <w:jc w:val="both"/>
         <w:rPr>
           <w:rFonts w:asciiTheme="minorBidi" w:hAnsiTheme="minorBidi" w:cstheme="minorBidi"/>
@@ -1620,7 +1728,7 @@
           <w:tab w:val="left" w:pos="283"/>
         </w:tabs>
         <w:suppressAutoHyphens/>
-        <w:spacing w:line="336" w:lineRule="auto"/>
+        <w:spacing w:line="324" w:lineRule="auto"/>
         <w:ind w:left="0" w:firstLine="0"/>
         <w:jc w:val="both"/>
         <w:rPr>
@@ -1663,7 +1771,25 @@
           <w:sz w:val="18"/>
           <w:szCs w:val="18"/>
         </w:rPr>
-        <w:t>«_PROMT»</w:t>
+        <w:t>«</w:t>
+      </w:r>
+      <w:r>
+        <w:rPr>
+          <w:rFonts w:asciiTheme="minorBidi" w:hAnsiTheme="minorBidi" w:cstheme="minorBidi"/>
+          <w:b/>
+          <w:sz w:val="18"/>
+          <w:szCs w:val="18"/>
+        </w:rPr>
+        <w:t>COMPRADOR</w:t>
+      </w:r>
+      <w:r>
+        <w:rPr>
+          <w:rFonts w:asciiTheme="minorBidi" w:hAnsiTheme="minorBidi" w:cstheme="minorBidi"/>
+          <w:b/>
+          <w:sz w:val="18"/>
+          <w:szCs w:val="18"/>
+        </w:rPr>
+        <w:t>»</w:t>
       </w:r>
       <w:r>
         <w:rPr>
@@ -1700,7 +1826,25 @@
           <w:sz w:val="18"/>
           <w:szCs w:val="18"/>
         </w:rPr>
-        <w:t>«_PROMT»</w:t>
+        <w:t>«</w:t>
+      </w:r>
+      <w:r>
+        <w:rPr>
+          <w:rFonts w:asciiTheme="minorBidi" w:hAnsiTheme="minorBidi" w:cstheme="minorBidi"/>
+          <w:bCs/>
+          <w:sz w:val="18"/>
+          <w:szCs w:val="18"/>
+        </w:rPr>
+        <w:t>COMPRADOR</w:t>
+      </w:r>
+      <w:r>
+        <w:rPr>
+          <w:rFonts w:asciiTheme="minorBidi" w:hAnsiTheme="minorBidi" w:cstheme="minorBidi"/>
+          <w:bCs/>
+          <w:sz w:val="18"/>
+          <w:szCs w:val="18"/>
+        </w:rPr>
+        <w:t>»</w:t>
       </w:r>
       <w:r>
         <w:rPr>
@@ -1771,7 +1915,27 @@
           <w:sz w:val="18"/>
           <w:szCs w:val="18"/>
         </w:rPr>
-        <w:t>«_PROMT»</w:t>
+        <w:t>«</w:t>
+      </w:r>
+      <w:r>
+        <w:rPr>
+          <w:rFonts w:asciiTheme="minorBidi" w:hAnsiTheme="minorBidi" w:cstheme="minorBidi"/>
+          <w:b/>
+          <w:bCs/>
+          <w:sz w:val="18"/>
+          <w:szCs w:val="18"/>
+        </w:rPr>
+        <w:t>COMPRADOR</w:t>
+      </w:r>
+      <w:r>
+        <w:rPr>
+          <w:rFonts w:asciiTheme="minorBidi" w:hAnsiTheme="minorBidi" w:cstheme="minorBidi"/>
+          <w:b/>
+          <w:bCs/>
+          <w:sz w:val="18"/>
+          <w:szCs w:val="18"/>
+        </w:rPr>
+        <w:t>»</w:t>
       </w:r>
       <w:r>
         <w:rPr>
@@ -1952,127 +2116,7 @@
           <w:sz w:val="18"/>
           <w:szCs w:val="18"/>
         </w:rPr>
-        <w:t xml:space="preserve"> </w:t>
-      </w:r>
-      <w:r>
-        <w:rPr>
-          <w:rFonts w:asciiTheme="minorBidi" w:hAnsiTheme="minorBidi" w:cstheme="minorBidi"/>
-          <w:sz w:val="18"/>
-          <w:szCs w:val="18"/>
-        </w:rPr>
-        <w:t>DE</w:t>
-      </w:r>
-      <w:r>
-        <w:rPr>
-          <w:rFonts w:asciiTheme="minorBidi" w:hAnsiTheme="minorBidi" w:cstheme="minorBidi"/>
-          <w:sz w:val="18"/>
-          <w:szCs w:val="18"/>
-        </w:rPr>
-        <w:t xml:space="preserve"> </w:t>
-      </w:r>
-      <w:r>
-        <w:rPr>
-          <w:rFonts w:asciiTheme="minorBidi" w:hAnsiTheme="minorBidi" w:cstheme="minorBidi"/>
-          <w:sz w:val="18"/>
-          <w:szCs w:val="18"/>
-        </w:rPr>
-        <w:t>LA</w:t>
-      </w:r>
-      <w:r>
-        <w:rPr>
-          <w:rFonts w:asciiTheme="minorBidi" w:hAnsiTheme="minorBidi" w:cstheme="minorBidi"/>
-          <w:sz w:val="18"/>
-          <w:szCs w:val="18"/>
-        </w:rPr>
-        <w:t xml:space="preserve"> </w:t>
-      </w:r>
-      <w:r>
-        <w:rPr>
-          <w:rFonts w:asciiTheme="minorBidi" w:hAnsiTheme="minorBidi" w:cstheme="minorBidi"/>
-          <w:sz w:val="18"/>
-          <w:szCs w:val="18"/>
-        </w:rPr>
-        <w:t>ENTREGA</w:t>
-      </w:r>
-      <w:r>
-        <w:rPr>
-          <w:rFonts w:asciiTheme="minorBidi" w:hAnsiTheme="minorBidi" w:cstheme="minorBidi"/>
-          <w:sz w:val="18"/>
-          <w:szCs w:val="18"/>
-        </w:rPr>
-        <w:t xml:space="preserve"> </w:t>
-      </w:r>
-      <w:r>
-        <w:rPr>
-          <w:rFonts w:asciiTheme="minorBidi" w:hAnsiTheme="minorBidi" w:cstheme="minorBidi"/>
-          <w:sz w:val="18"/>
-          <w:szCs w:val="18"/>
-        </w:rPr>
-        <w:t>DE</w:t>
-      </w:r>
-      <w:r>
-        <w:rPr>
-          <w:rFonts w:asciiTheme="minorBidi" w:hAnsiTheme="minorBidi" w:cstheme="minorBidi"/>
-          <w:sz w:val="18"/>
-          <w:szCs w:val="18"/>
-        </w:rPr>
-        <w:t xml:space="preserve"> </w:t>
-      </w:r>
-      <w:r>
-        <w:rPr>
-          <w:rFonts w:asciiTheme="minorBidi" w:hAnsiTheme="minorBidi" w:cstheme="minorBidi"/>
-          <w:sz w:val="18"/>
-          <w:szCs w:val="18"/>
-        </w:rPr>
-        <w:t>LOS</w:t>
-      </w:r>
-      <w:r>
-        <w:rPr>
-          <w:rFonts w:asciiTheme="minorBidi" w:hAnsiTheme="minorBidi" w:cstheme="minorBidi"/>
-          <w:sz w:val="18"/>
-          <w:szCs w:val="18"/>
-        </w:rPr>
-        <w:t xml:space="preserve"> </w:t>
-      </w:r>
-      <w:r>
-        <w:rPr>
-          <w:rFonts w:asciiTheme="minorBidi" w:hAnsiTheme="minorBidi" w:cstheme="minorBidi"/>
-          <w:sz w:val="18"/>
-          <w:szCs w:val="18"/>
-        </w:rPr>
-        <w:t>INMUEBLES</w:t>
-      </w:r>
-      <w:r>
-        <w:rPr>
-          <w:rFonts w:asciiTheme="minorBidi" w:hAnsiTheme="minorBidi" w:cstheme="minorBidi"/>
-          <w:sz w:val="18"/>
-          <w:szCs w:val="18"/>
-        </w:rPr>
-        <w:t xml:space="preserve"> Y</w:t>
-      </w:r>
-      <w:r>
-        <w:rPr>
-          <w:rFonts w:asciiTheme="minorBidi" w:hAnsiTheme="minorBidi" w:cstheme="minorBidi"/>
-          <w:sz w:val="18"/>
-          <w:szCs w:val="18"/>
-        </w:rPr>
-        <w:t xml:space="preserve"> </w:t>
-      </w:r>
-      <w:r>
-        <w:rPr>
-          <w:rFonts w:asciiTheme="minorBidi" w:hAnsiTheme="minorBidi" w:cstheme="minorBidi"/>
-          <w:sz w:val="18"/>
-          <w:szCs w:val="18"/>
-        </w:rPr>
-        <w:t>LA INDEPENDIZACION:</w:t>
-      </w:r>
-      <w:r>
-        <w:rPr>
-          <w:rFonts w:asciiTheme="minorBidi" w:hAnsiTheme="minorBidi" w:cstheme="minorBidi"/>
-          <w:sz w:val="18"/>
-          <w:szCs w:val="18"/>
-        </w:rPr>
-        <w:t xml:space="preserve"> </w:t>
+        <w:t xml:space="preserve"> DE LA ENTREGA DE LOS INMUEBLES Y LA INDEPENDIZACION: </w:t>
       </w:r>
     </w:p>
     <w:p>
@@ -2110,73 +2154,49 @@
           <w:sz w:val="18"/>
           <w:szCs w:val="18"/>
         </w:rPr>
-        <w:t xml:space="preserve"> SE OBLIGA A ENTREGAR EL INMUEBLE OBJETO DEL PRESENTE CONTRATO A</w:t>
-      </w:r>
-      <w:r>
-        <w:rPr>
-          <w:rFonts w:asciiTheme="minorBidi" w:hAnsiTheme="minorBidi" w:cstheme="minorBidi"/>
-          <w:sz w:val="18"/>
-          <w:szCs w:val="18"/>
-        </w:rPr>
-        <w:t xml:space="preserve"> FAVOR DE</w:t>
-      </w:r>
-      <w:r>
-        <w:rPr>
-          <w:rFonts w:asciiTheme="minorBidi" w:hAnsiTheme="minorBidi" w:cstheme="minorBidi"/>
-          <w:sz w:val="18"/>
-          <w:szCs w:val="18"/>
-        </w:rPr>
-        <w:t xml:space="preserve"> </w:t>
-      </w:r>
-      <w:r>
-        <w:rPr>
-          <w:rFonts w:asciiTheme="minorBidi" w:hAnsiTheme="minorBidi" w:cstheme="minorBidi"/>
-          <w:sz w:val="18"/>
-          <w:szCs w:val="18"/>
-        </w:rPr>
-        <w:t>«_PROMT»</w:t>
-      </w:r>
-      <w:r>
-        <w:rPr>
-          <w:rFonts w:asciiTheme="minorBidi" w:hAnsiTheme="minorBidi" w:cstheme="minorBidi"/>
-          <w:sz w:val="18"/>
-          <w:szCs w:val="18"/>
-        </w:rPr>
-        <w:t xml:space="preserve">, UNA VEZ REALIZADA LA INDEPENDIZACIÓN DE EL INMUEBLE OBJETO DEL PRESENTE CONTRATO EN EL REGISTRO PÚBLICO PERTINENTE, Y TOTALMENTE SANEADO, PARA CUYOS EFECTOS, LAS PARTES ACUERDAN </w:t>
-      </w:r>
-      <w:r>
-        <w:rPr>
-          <w:rFonts w:asciiTheme="minorBidi" w:hAnsiTheme="minorBidi" w:cstheme="minorBidi"/>
-          <w:sz w:val="18"/>
-          <w:szCs w:val="18"/>
-        </w:rPr>
-        <w:t>PRELIMINARMENTE</w:t>
-      </w:r>
-      <w:r>
-        <w:rPr>
-          <w:rFonts w:asciiTheme="minorBidi" w:hAnsiTheme="minorBidi" w:cstheme="minorBidi"/>
-          <w:sz w:val="18"/>
-          <w:szCs w:val="18"/>
-        </w:rPr>
-        <w:t xml:space="preserve"> COMO FECHA DE ENTREGA </w:t>
-      </w:r>
-      <w:r>
-        <w:rPr>
-          <w:rFonts w:asciiTheme="minorBidi" w:hAnsiTheme="minorBidi" w:cstheme="minorBidi"/>
-          <w:sz w:val="18"/>
-          <w:szCs w:val="18"/>
-        </w:rPr>
-        <w:t xml:space="preserve">EN </w:t>
-      </w:r>
-      <w:r>
-        <w:rPr>
-          <w:rFonts w:asciiTheme="minorBidi" w:hAnsiTheme="minorBidi" w:cstheme="minorBidi"/>
-          <w:b/>
-          <w:bCs/>
-          <w:sz w:val="18"/>
-          <w:szCs w:val="18"/>
-        </w:rPr>
-        <w:t>18</w:t>
+        <w:t xml:space="preserve"> SE OBLIGA A ENTREGAR EL INMUEBLE OBJETO DEL PRESENTE CONTRATO A FAVOR DE </w:t>
+      </w:r>
+      <w:r>
+        <w:rPr>
+          <w:rFonts w:asciiTheme="minorBidi" w:hAnsiTheme="minorBidi" w:cstheme="minorBidi"/>
+          <w:sz w:val="18"/>
+          <w:szCs w:val="18"/>
+        </w:rPr>
+        <w:t>«</w:t>
+      </w:r>
+      <w:r>
+        <w:rPr>
+          <w:rFonts w:asciiTheme="minorBidi" w:hAnsiTheme="minorBidi" w:cstheme="minorBidi"/>
+          <w:sz w:val="18"/>
+          <w:szCs w:val="18"/>
+        </w:rPr>
+        <w:t>COMPRADOR</w:t>
+      </w:r>
+      <w:r>
+        <w:rPr>
+          <w:rFonts w:asciiTheme="minorBidi" w:hAnsiTheme="minorBidi" w:cstheme="minorBidi"/>
+          <w:sz w:val="18"/>
+          <w:szCs w:val="18"/>
+        </w:rPr>
+        <w:t>»</w:t>
+      </w:r>
+      <w:r>
+        <w:rPr>
+          <w:rFonts w:asciiTheme="minorBidi" w:hAnsiTheme="minorBidi" w:cstheme="minorBidi"/>
+          <w:sz w:val="18"/>
+          <w:szCs w:val="18"/>
+        </w:rPr>
+        <w:t xml:space="preserve">, UNA VEZ REALIZADA LA INDEPENDIZACIÓN DE EL INMUEBLE OBJETO DEL PRESENTE CONTRATO EN EL REGISTRO PÚBLICO PERTINENTE, Y TOTALMENTE SANEADO, PARA CUYOS EFECTOS, LAS PARTES ACUERDAN PRELIMINARMENTE COMO FECHA DE ENTREGA EN </w:t>
+      </w:r>
+      <w:r>
+        <w:rPr>
+          <w:rFonts w:asciiTheme="minorBidi" w:hAnsiTheme="minorBidi" w:cstheme="minorBidi"/>
+          <w:b/>
+          <w:bCs/>
+          <w:sz w:val="18"/>
+          <w:szCs w:val="18"/>
+        </w:rPr>
+        <w:t>«ENTREGA»</w:t>
       </w:r>
       <w:r>
         <w:rPr>
@@ -2196,7 +2216,7 @@
           <w:sz w:val="18"/>
           <w:szCs w:val="18"/>
         </w:rPr>
-        <w:t>DIECIOCHO</w:t>
+        <w:t>«ENTREGA_TEXTO»</w:t>
       </w:r>
       <w:r>
         <w:rPr>
@@ -2214,15 +2234,7 @@
           <w:sz w:val="18"/>
           <w:szCs w:val="18"/>
         </w:rPr>
-        <w:t>MESES CONTADOS A PARTIR DE LA SUSCRIPCION DE LA PRESENTE MINUTA</w:t>
-      </w:r>
-      <w:r>
-        <w:rPr>
-          <w:rFonts w:asciiTheme="minorBidi" w:hAnsiTheme="minorBidi" w:cstheme="minorBidi"/>
-          <w:sz w:val="18"/>
-          <w:szCs w:val="18"/>
-        </w:rPr>
-        <w:t xml:space="preserve">. </w:t>
+        <w:t xml:space="preserve">MESES CONTADOS A PARTIR DE LA SUSCRIPCION DE LA PRESENTE MINUTA. </w:t>
       </w:r>
     </w:p>
     <w:p>
@@ -2242,53 +2254,13 @@
           <w:sz w:val="18"/>
           <w:szCs w:val="18"/>
         </w:rPr>
-        <w:t>SIN PERJUICIO DE LO ANTERIOR, LAS PARTES ACUERDAN QUE EXCEPCIONALMENTE, LA FECHA MAXIMA DE ENTREGA PUEDE SER PRORROGADA O AMPLIADA HASTA POR TRES (03) MESES</w:t>
-      </w:r>
-      <w:r>
-        <w:rPr>
-          <w:rFonts w:asciiTheme="minorBidi" w:hAnsiTheme="minorBidi" w:cstheme="minorBidi"/>
-          <w:sz w:val="18"/>
-          <w:szCs w:val="18"/>
-        </w:rPr>
-        <w:t xml:space="preserve"> MÁS,</w:t>
-      </w:r>
-      <w:r>
-        <w:rPr>
-          <w:rFonts w:asciiTheme="minorBidi" w:hAnsiTheme="minorBidi" w:cstheme="minorBidi"/>
-          <w:sz w:val="18"/>
-          <w:szCs w:val="18"/>
-        </w:rPr>
-        <w:t xml:space="preserve"> CONTADOS A PARTIR DEL DÍA SIGUIENTE DE VENCIDO EL PLAZO SEÑALADO EN EL PÁRRAFO</w:t>
-      </w:r>
-      <w:r>
-        <w:rPr>
-          <w:rFonts w:asciiTheme="minorBidi" w:hAnsiTheme="minorBidi" w:cstheme="minorBidi"/>
-          <w:sz w:val="18"/>
-          <w:szCs w:val="18"/>
-        </w:rPr>
-        <w:t xml:space="preserve"> </w:t>
-      </w:r>
-      <w:r>
-        <w:rPr>
-          <w:rFonts w:asciiTheme="minorBidi" w:hAnsiTheme="minorBidi" w:cstheme="minorBidi"/>
-          <w:sz w:val="18"/>
-          <w:szCs w:val="18"/>
-        </w:rPr>
-        <w:t>ANTERIOR.</w:t>
-      </w:r>
-      <w:r>
-        <w:rPr>
-          <w:rFonts w:asciiTheme="minorBidi" w:hAnsiTheme="minorBidi" w:cstheme="minorBidi"/>
-          <w:sz w:val="18"/>
-          <w:szCs w:val="18"/>
-        </w:rPr>
-        <w:t xml:space="preserve"> </w:t>
+        <w:t xml:space="preserve">SIN PERJUICIO DE LO ANTERIOR, LAS PARTES ACUERDAN QUE EXCEPCIONALMENTE, LA FECHA MAXIMA DE ENTREGA PUEDE SER PRORROGADA O AMPLIADA HASTA POR TRES (03) MESES MÁS, CONTADOS A PARTIR DEL DÍA SIGUIENTE DE VENCIDO EL PLAZO SEÑALADO EN EL PÁRRAFO ANTERIOR. </w:t>
       </w:r>
     </w:p>
     <w:p>
       <w:pPr>
         <w:pStyle w:val="NormalWeb"/>
-        <w:spacing w:before="0" w:beforeAutospacing="0" w:after="0" w:afterAutospacing="0" w:line="336" w:lineRule="auto"/>
+        <w:spacing w:before="0" w:beforeAutospacing="0" w:after="0" w:afterAutospacing="0" w:line="324" w:lineRule="auto"/>
         <w:jc w:val="both"/>
         <w:rPr>
           <w:rFonts w:asciiTheme="minorBidi" w:hAnsiTheme="minorBidi" w:cstheme="minorBidi"/>
@@ -2340,7 +2312,27 @@
           <w:sz w:val="18"/>
           <w:szCs w:val="18"/>
         </w:rPr>
-        <w:t>«_PROMT»</w:t>
+        <w:t>«</w:t>
+      </w:r>
+      <w:r>
+        <w:rPr>
+          <w:rFonts w:asciiTheme="minorBidi" w:hAnsiTheme="minorBidi" w:cstheme="minorBidi"/>
+          <w:b/>
+          <w:bCs/>
+          <w:sz w:val="18"/>
+          <w:szCs w:val="18"/>
+        </w:rPr>
+        <w:t>COMPRADOR</w:t>
+      </w:r>
+      <w:r>
+        <w:rPr>
+          <w:rFonts w:asciiTheme="minorBidi" w:hAnsiTheme="minorBidi" w:cstheme="minorBidi"/>
+          <w:b/>
+          <w:bCs/>
+          <w:sz w:val="18"/>
+          <w:szCs w:val="18"/>
+        </w:rPr>
+        <w:t>»</w:t>
       </w:r>
       <w:r>
         <w:rPr>
@@ -2372,7 +2364,7 @@
     <w:p>
       <w:pPr>
         <w:pStyle w:val="NormalWeb"/>
-        <w:spacing w:before="0" w:beforeAutospacing="0" w:after="0" w:afterAutospacing="0" w:line="336" w:lineRule="auto"/>
+        <w:spacing w:before="0" w:beforeAutospacing="0" w:after="0" w:afterAutospacing="0" w:line="324" w:lineRule="auto"/>
         <w:jc w:val="both"/>
         <w:rPr>
           <w:rFonts w:asciiTheme="minorBidi" w:hAnsiTheme="minorBidi" w:cstheme="minorBidi"/>
@@ -2486,16 +2478,7 @@
           <w:sz w:val="18"/>
           <w:szCs w:val="18"/>
         </w:rPr>
-        <w:t xml:space="preserve">USOS, COSTUMBRES, </w:t>
-      </w:r>
-      <w:r>
-        <w:rPr>
-          <w:rFonts w:asciiTheme="minorBidi" w:hAnsiTheme="minorBidi" w:cstheme="minorBidi"/>
-          <w:sz w:val="18"/>
-          <w:szCs w:val="18"/>
-        </w:rPr>
-        <w:lastRenderedPageBreak/>
-        <w:t>SERVIDUMBRES) Y TODO CUANTO DE HECHO O POR DERECHO LE CORRESPONDE Y ES INHERENTE A AQUELLO QUE SE VENDE, SIN RESERVA NI LIMITACIÓN ALGUNA.</w:t>
+        <w:t>USOS, COSTUMBRES, SERVIDUMBRES) Y TODO CUANTO DE HECHO O POR DERECHO LE CORRESPONDE Y ES INHERENTE A AQUELLO QUE SE VENDE, SIN RESERVA NI LIMITACIÓN ALGUNA.</w:t>
       </w:r>
       <w:r>
         <w:rPr>
@@ -2509,7 +2492,7 @@
     <w:p>
       <w:pPr>
         <w:pStyle w:val="NormalWeb"/>
-        <w:spacing w:before="0" w:beforeAutospacing="0" w:after="0" w:afterAutospacing="0" w:line="336" w:lineRule="auto"/>
+        <w:spacing w:before="0" w:beforeAutospacing="0" w:after="0" w:afterAutospacing="0" w:line="324" w:lineRule="auto"/>
         <w:jc w:val="both"/>
         <w:rPr>
           <w:rFonts w:asciiTheme="minorBidi" w:hAnsiTheme="minorBidi" w:cstheme="minorBidi"/>
@@ -2526,6 +2509,7 @@
           <w:sz w:val="18"/>
           <w:szCs w:val="18"/>
         </w:rPr>
+        <w:lastRenderedPageBreak/>
         <w:t>NOVENA</w:t>
       </w:r>
       <w:r>
@@ -2549,7 +2533,7 @@
     <w:p>
       <w:pPr>
         <w:pStyle w:val="NormalWeb"/>
-        <w:spacing w:before="0" w:beforeAutospacing="0" w:after="0" w:afterAutospacing="0" w:line="336" w:lineRule="auto"/>
+        <w:spacing w:before="0" w:beforeAutospacing="0" w:after="0" w:afterAutospacing="0" w:line="324" w:lineRule="auto"/>
         <w:jc w:val="both"/>
         <w:rPr>
           <w:rFonts w:asciiTheme="minorBidi" w:hAnsiTheme="minorBidi" w:cstheme="minorBidi"/>
@@ -2609,7 +2593,7 @@
     <w:p>
       <w:pPr>
         <w:pStyle w:val="NormalWeb"/>
-        <w:spacing w:before="0" w:beforeAutospacing="0" w:after="0" w:afterAutospacing="0" w:line="336" w:lineRule="auto"/>
+        <w:spacing w:before="0" w:beforeAutospacing="0" w:after="0" w:afterAutospacing="0" w:line="324" w:lineRule="auto"/>
         <w:jc w:val="both"/>
         <w:rPr>
           <w:rFonts w:asciiTheme="minorBidi" w:hAnsiTheme="minorBidi" w:cstheme="minorBidi"/>
@@ -2665,7 +2649,7 @@
     <w:p>
       <w:pPr>
         <w:pStyle w:val="NormalWeb"/>
-        <w:spacing w:before="0" w:beforeAutospacing="0" w:after="0" w:afterAutospacing="0" w:line="336" w:lineRule="auto"/>
+        <w:spacing w:before="0" w:beforeAutospacing="0" w:after="0" w:afterAutospacing="0" w:line="324" w:lineRule="auto"/>
         <w:jc w:val="both"/>
         <w:rPr>
           <w:rFonts w:asciiTheme="minorBidi" w:hAnsiTheme="minorBidi" w:cstheme="minorBidi"/>
@@ -2717,7 +2701,7 @@
     <w:p>
       <w:pPr>
         <w:pStyle w:val="NormalWeb"/>
-        <w:spacing w:before="0" w:beforeAutospacing="0" w:after="0" w:afterAutospacing="0" w:line="336" w:lineRule="auto"/>
+        <w:spacing w:before="0" w:beforeAutospacing="0" w:after="0" w:afterAutospacing="0" w:line="324" w:lineRule="auto"/>
         <w:jc w:val="both"/>
         <w:rPr>
           <w:rFonts w:asciiTheme="minorBidi" w:hAnsiTheme="minorBidi" w:cstheme="minorBidi"/>
@@ -2747,7 +2731,23 @@
           <w:sz w:val="18"/>
           <w:szCs w:val="18"/>
         </w:rPr>
-        <w:t>«_PROMT»</w:t>
+        <w:t>«</w:t>
+      </w:r>
+      <w:r>
+        <w:rPr>
+          <w:rFonts w:asciiTheme="minorBidi" w:hAnsiTheme="minorBidi" w:cstheme="minorBidi"/>
+          <w:sz w:val="18"/>
+          <w:szCs w:val="18"/>
+        </w:rPr>
+        <w:t>COMPRADOR</w:t>
+      </w:r>
+      <w:r>
+        <w:rPr>
+          <w:rFonts w:asciiTheme="minorBidi" w:hAnsiTheme="minorBidi" w:cstheme="minorBidi"/>
+          <w:sz w:val="18"/>
+          <w:szCs w:val="18"/>
+        </w:rPr>
+        <w:t>»</w:t>
       </w:r>
       <w:r>
         <w:rPr>
@@ -2793,7 +2793,7 @@
     <w:p>
       <w:pPr>
         <w:pStyle w:val="NormalWeb"/>
-        <w:spacing w:before="0" w:beforeAutospacing="0" w:after="0" w:afterAutospacing="0" w:line="336" w:lineRule="auto"/>
+        <w:spacing w:before="0" w:beforeAutospacing="0" w:after="0" w:afterAutospacing="0" w:line="324" w:lineRule="auto"/>
         <w:jc w:val="both"/>
         <w:rPr>
           <w:rFonts w:asciiTheme="minorBidi" w:hAnsiTheme="minorBidi" w:cstheme="minorBidi"/>
@@ -2823,7 +2823,23 @@
           <w:sz w:val="18"/>
           <w:szCs w:val="18"/>
         </w:rPr>
-        <w:t>«_PROMT»</w:t>
+        <w:t>«</w:t>
+      </w:r>
+      <w:r>
+        <w:rPr>
+          <w:rFonts w:asciiTheme="minorBidi" w:hAnsiTheme="minorBidi" w:cstheme="minorBidi"/>
+          <w:sz w:val="18"/>
+          <w:szCs w:val="18"/>
+        </w:rPr>
+        <w:t>COMPRADOR</w:t>
+      </w:r>
+      <w:r>
+        <w:rPr>
+          <w:rFonts w:asciiTheme="minorBidi" w:hAnsiTheme="minorBidi" w:cstheme="minorBidi"/>
+          <w:sz w:val="18"/>
+          <w:szCs w:val="18"/>
+        </w:rPr>
+        <w:t>»</w:t>
       </w:r>
       <w:r>
         <w:rPr>
@@ -2853,7 +2869,7 @@
     <w:p>
       <w:pPr>
         <w:pStyle w:val="NormalWeb"/>
-        <w:spacing w:before="0" w:beforeAutospacing="0" w:after="0" w:afterAutospacing="0" w:line="336" w:lineRule="auto"/>
+        <w:spacing w:before="0" w:beforeAutospacing="0" w:after="0" w:afterAutospacing="0" w:line="324" w:lineRule="auto"/>
         <w:jc w:val="both"/>
         <w:rPr>
           <w:rFonts w:asciiTheme="minorBidi" w:hAnsiTheme="minorBidi" w:cstheme="minorBidi"/>
@@ -2889,7 +2905,7 @@
     <w:p>
       <w:pPr>
         <w:pStyle w:val="NormalWeb"/>
-        <w:spacing w:before="0" w:beforeAutospacing="0" w:after="0" w:afterAutospacing="0" w:line="336" w:lineRule="auto"/>
+        <w:spacing w:before="0" w:beforeAutospacing="0" w:after="0" w:afterAutospacing="0" w:line="324" w:lineRule="auto"/>
         <w:jc w:val="both"/>
         <w:rPr>
           <w:rFonts w:asciiTheme="minorBidi" w:hAnsiTheme="minorBidi" w:cstheme="minorBidi"/>
@@ -2957,7 +2973,7 @@
     <w:p>
       <w:pPr>
         <w:pStyle w:val="NormalWeb"/>
-        <w:spacing w:before="0" w:beforeAutospacing="0" w:after="0" w:afterAutospacing="0" w:line="336" w:lineRule="auto"/>
+        <w:spacing w:before="0" w:beforeAutospacing="0" w:after="0" w:afterAutospacing="0" w:line="324" w:lineRule="auto"/>
         <w:jc w:val="both"/>
         <w:rPr>
           <w:rFonts w:asciiTheme="minorBidi" w:hAnsiTheme="minorBidi" w:cstheme="minorBidi"/>
@@ -2993,7 +3009,7 @@
     <w:p>
       <w:pPr>
         <w:pStyle w:val="NormalWeb"/>
-        <w:spacing w:before="0" w:beforeAutospacing="0" w:after="0" w:afterAutospacing="0" w:line="336" w:lineRule="auto"/>
+        <w:spacing w:before="0" w:beforeAutospacing="0" w:after="0" w:afterAutospacing="0" w:line="324" w:lineRule="auto"/>
         <w:jc w:val="both"/>
         <w:rPr>
           <w:rFonts w:asciiTheme="minorBidi" w:hAnsiTheme="minorBidi" w:cstheme="minorBidi"/>
@@ -3045,7 +3061,23 @@
           <w:sz w:val="18"/>
           <w:szCs w:val="18"/>
         </w:rPr>
-        <w:t>«_PROMT»</w:t>
+        <w:t>«</w:t>
+      </w:r>
+      <w:r>
+        <w:rPr>
+          <w:rFonts w:asciiTheme="minorBidi" w:hAnsiTheme="minorBidi" w:cstheme="minorBidi"/>
+          <w:sz w:val="18"/>
+          <w:szCs w:val="18"/>
+        </w:rPr>
+        <w:t>COMPRADOR</w:t>
+      </w:r>
+      <w:r>
+        <w:rPr>
+          <w:rFonts w:asciiTheme="minorBidi" w:hAnsiTheme="minorBidi" w:cstheme="minorBidi"/>
+          <w:sz w:val="18"/>
+          <w:szCs w:val="18"/>
+        </w:rPr>
+        <w:t>»</w:t>
       </w:r>
       <w:r>
         <w:rPr>
@@ -3059,7 +3091,7 @@
     <w:p>
       <w:pPr>
         <w:pStyle w:val="NormalWeb"/>
-        <w:spacing w:before="0" w:beforeAutospacing="0" w:after="0" w:afterAutospacing="0" w:line="336" w:lineRule="auto"/>
+        <w:spacing w:before="0" w:beforeAutospacing="0" w:after="0" w:afterAutospacing="0" w:line="324" w:lineRule="auto"/>
         <w:jc w:val="both"/>
         <w:rPr>
           <w:rFonts w:asciiTheme="minorBidi" w:hAnsiTheme="minorBidi" w:cstheme="minorBidi"/>
@@ -3131,7 +3163,7 @@
     <w:p>
       <w:pPr>
         <w:pStyle w:val="NormalWeb"/>
-        <w:spacing w:before="0" w:beforeAutospacing="0" w:after="0" w:afterAutospacing="0" w:line="336" w:lineRule="auto"/>
+        <w:spacing w:before="0" w:beforeAutospacing="0" w:after="0" w:afterAutospacing="0" w:line="324" w:lineRule="auto"/>
         <w:jc w:val="both"/>
         <w:rPr>
           <w:rFonts w:asciiTheme="minorBidi" w:hAnsiTheme="minorBidi" w:cstheme="minorBidi"/>
@@ -3152,7 +3184,7 @@
     <w:p>
       <w:pPr>
         <w:pStyle w:val="NormalWeb"/>
-        <w:spacing w:before="0" w:beforeAutospacing="0" w:after="0" w:afterAutospacing="0" w:line="336" w:lineRule="auto"/>
+        <w:spacing w:before="0" w:beforeAutospacing="0" w:after="0" w:afterAutospacing="0" w:line="324" w:lineRule="auto"/>
         <w:jc w:val="both"/>
         <w:rPr>
           <w:rFonts w:asciiTheme="minorBidi" w:hAnsiTheme="minorBidi" w:cstheme="minorBidi"/>
@@ -3210,7 +3242,7 @@
     <w:p>
       <w:pPr>
         <w:pStyle w:val="NormalWeb"/>
-        <w:spacing w:before="0" w:beforeAutospacing="0" w:after="0" w:afterAutospacing="0" w:line="336" w:lineRule="auto"/>
+        <w:spacing w:before="0" w:beforeAutospacing="0" w:after="0" w:afterAutospacing="0" w:line="324" w:lineRule="auto"/>
         <w:jc w:val="both"/>
         <w:rPr>
           <w:rFonts w:asciiTheme="minorBidi" w:hAnsiTheme="minorBidi" w:cstheme="minorBidi"/>
@@ -3232,13 +3264,29 @@
           <w:sz w:val="18"/>
           <w:szCs w:val="18"/>
         </w:rPr>
-        <w:t>, «FECHA_TEXTO».</w:t>
+        <w:t>, «</w:t>
+      </w:r>
+      <w:r>
+        <w:rPr>
+          <w:rFonts w:asciiTheme="minorBidi" w:hAnsiTheme="minorBidi" w:cstheme="minorBidi"/>
+          <w:sz w:val="18"/>
+          <w:szCs w:val="18"/>
+        </w:rPr>
+        <w:t>FECHA</w:t>
+      </w:r>
+      <w:r>
+        <w:rPr>
+          <w:rFonts w:asciiTheme="minorBidi" w:hAnsiTheme="minorBidi" w:cstheme="minorBidi"/>
+          <w:sz w:val="18"/>
+          <w:szCs w:val="18"/>
+        </w:rPr>
+        <w:t>».</w:t>
       </w:r>
     </w:p>
     <w:p>
       <w:pPr>
         <w:pStyle w:val="NormalWeb"/>
-        <w:spacing w:before="0" w:beforeAutospacing="0" w:after="0" w:afterAutospacing="0" w:line="336" w:lineRule="auto"/>
+        <w:spacing w:before="0" w:beforeAutospacing="0" w:after="0" w:afterAutospacing="0" w:line="324" w:lineRule="auto"/>
         <w:jc w:val="both"/>
         <w:rPr>
           <w:rFonts w:asciiTheme="minorBidi" w:hAnsiTheme="minorBidi" w:cstheme="minorBidi"/>
@@ -3250,7 +3298,7 @@
     <w:p>
       <w:pPr>
         <w:pStyle w:val="NormalWeb"/>
-        <w:spacing w:before="0" w:beforeAutospacing="0" w:after="0" w:afterAutospacing="0" w:line="336" w:lineRule="auto"/>
+        <w:spacing w:before="0" w:beforeAutospacing="0" w:after="0" w:afterAutospacing="0" w:line="324" w:lineRule="auto"/>
         <w:jc w:val="both"/>
         <w:rPr>
           <w:rFonts w:asciiTheme="minorBidi" w:hAnsiTheme="minorBidi" w:cstheme="minorBidi"/>
@@ -3265,7 +3313,7 @@
         <w:autoSpaceDE w:val="0"/>
         <w:autoSpaceDN w:val="0"/>
         <w:adjustRightInd w:val="0"/>
-        <w:spacing w:line="336" w:lineRule="auto"/>
+        <w:spacing w:line="324" w:lineRule="auto"/>
         <w:jc w:val="both"/>
         <w:rPr>
           <w:rFonts w:asciiTheme="minorBidi" w:hAnsiTheme="minorBidi" w:cstheme="minorBidi"/>
@@ -3292,8 +3340,7 @@
         <w:autoSpaceDE w:val="0"/>
         <w:autoSpaceDN w:val="0"/>
         <w:adjustRightInd w:val="0"/>
-        <w:spacing w:line="336" w:lineRule="auto"/>
-        <w:ind w:left="709"/>
+        <w:spacing w:line="324" w:lineRule="auto"/>
         <w:jc w:val="both"/>
         <w:rPr>
           <w:rFonts w:asciiTheme="minorBidi" w:hAnsiTheme="minorBidi" w:cstheme="minorBidi"/>
@@ -3310,7 +3357,7 @@
         <w:autoSpaceDE w:val="0"/>
         <w:autoSpaceDN w:val="0"/>
         <w:adjustRightInd w:val="0"/>
-        <w:spacing w:line="336" w:lineRule="auto"/>
+        <w:spacing w:line="324" w:lineRule="auto"/>
         <w:jc w:val="both"/>
         <w:rPr>
           <w:rFonts w:asciiTheme="minorBidi" w:hAnsiTheme="minorBidi" w:cstheme="minorBidi"/>
@@ -3327,7 +3374,7 @@
         <w:autoSpaceDE w:val="0"/>
         <w:autoSpaceDN w:val="0"/>
         <w:adjustRightInd w:val="0"/>
-        <w:spacing w:line="336" w:lineRule="auto"/>
+        <w:spacing w:line="324" w:lineRule="auto"/>
         <w:jc w:val="both"/>
         <w:rPr>
           <w:rFonts w:asciiTheme="minorBidi" w:hAnsiTheme="minorBidi" w:cstheme="minorBidi"/>
@@ -3336,6 +3383,12 @@
           <w:sz w:val="18"/>
           <w:szCs w:val="18"/>
         </w:rPr>
+        <w:sectPr>
+          <w:pgSz w:w="11906" w:h="16838"/>
+          <w:pgMar w:top="1440" w:right="1440" w:bottom="1440" w:left="1440" w:header="709" w:footer="709" w:gutter="0"/>
+          <w:cols w:space="708"/>
+          <w:docGrid w:linePitch="360"/>
+        </w:sectPr>
       </w:pPr>
     </w:p>
     <w:p>
@@ -3344,16 +3397,36 @@
         <w:autoSpaceDE w:val="0"/>
         <w:autoSpaceDN w:val="0"/>
         <w:adjustRightInd w:val="0"/>
-        <w:spacing w:line="336" w:lineRule="auto"/>
-        <w:jc w:val="both"/>
-        <w:rPr>
-          <w:rFonts w:asciiTheme="minorBidi" w:hAnsiTheme="minorBidi" w:cstheme="minorBidi"/>
-          <w:b/>
-          <w:bCs/>
-          <w:sz w:val="18"/>
-          <w:szCs w:val="18"/>
-        </w:rPr>
-      </w:pPr>
+        <w:spacing w:line="324" w:lineRule="auto"/>
+        <w:jc w:val="center"/>
+        <w:rPr>
+          <w:rFonts w:asciiTheme="minorBidi" w:hAnsiTheme="minorBidi" w:cstheme="minorBidi"/>
+          <w:b/>
+          <w:bCs/>
+          <w:sz w:val="18"/>
+          <w:szCs w:val="18"/>
+        </w:rPr>
+      </w:pPr>
+      <w:r>
+        <w:rPr>
+          <w:rFonts w:asciiTheme="minorBidi" w:hAnsiTheme="minorBidi" w:cstheme="minorBidi"/>
+          <w:b/>
+          <w:bCs/>
+          <w:sz w:val="18"/>
+          <w:szCs w:val="18"/>
+        </w:rPr>
+        <w:t>________________________________</w:t>
+      </w:r>
+      <w:r>
+        <w:rPr>
+          <w:rFonts w:asciiTheme="minorBidi" w:hAnsiTheme="minorBidi" w:cstheme="minorBidi"/>
+          <w:b/>
+          <w:bCs/>
+          <w:sz w:val="18"/>
+          <w:szCs w:val="18"/>
+        </w:rPr>
+        <w:t>______</w:t>
+      </w:r>
     </w:p>
     <w:p>
       <w:pPr>
@@ -3361,25 +3434,27 @@
         <w:autoSpaceDE w:val="0"/>
         <w:autoSpaceDN w:val="0"/>
         <w:adjustRightInd w:val="0"/>
-        <w:spacing w:line="336" w:lineRule="auto"/>
-        <w:jc w:val="both"/>
-        <w:rPr>
-          <w:rFonts w:asciiTheme="minorBidi" w:hAnsiTheme="minorBidi" w:cstheme="minorBidi"/>
-          <w:b/>
-          <w:bCs/>
-          <w:sz w:val="18"/>
-          <w:szCs w:val="18"/>
-        </w:rPr>
-      </w:pPr>
-      <w:r>
-        <w:rPr>
-          <w:rFonts w:asciiTheme="minorBidi" w:hAnsiTheme="minorBidi" w:cstheme="minorBidi"/>
-          <w:b/>
-          <w:bCs/>
-          <w:sz w:val="18"/>
-          <w:szCs w:val="18"/>
-        </w:rPr>
-        <w:t>______________________________________                                   ________________________________</w:t>
+        <w:spacing w:line="324" w:lineRule="auto"/>
+        <w:jc w:val="center"/>
+        <w:rPr>
+          <w:rFonts w:asciiTheme="minorBidi" w:eastAsia="Arial Unicode MS" w:hAnsiTheme="minorBidi" w:cstheme="minorBidi"/>
+          <w:b/>
+          <w:bCs/>
+          <w:sz w:val="18"/>
+          <w:szCs w:val="18"/>
+          <w:lang w:val="pt-BR"/>
+        </w:rPr>
+      </w:pPr>
+      <w:r>
+        <w:rPr>
+          <w:rFonts w:asciiTheme="minorBidi" w:eastAsia="Arial Unicode MS" w:hAnsiTheme="minorBidi" w:cstheme="minorBidi"/>
+          <w:b/>
+          <w:bCs/>
+          <w:sz w:val="18"/>
+          <w:szCs w:val="18"/>
+          <w:lang w:val="pt-BR"/>
+        </w:rPr>
+        <w:t>ILICH ALEXANDER MERCEDES VALVERDE</w:t>
       </w:r>
     </w:p>
     <w:p>
@@ -3388,8 +3463,8 @@
         <w:autoSpaceDE w:val="0"/>
         <w:autoSpaceDN w:val="0"/>
         <w:adjustRightInd w:val="0"/>
-        <w:spacing w:line="336" w:lineRule="auto"/>
-        <w:jc w:val="both"/>
+        <w:spacing w:line="324" w:lineRule="auto"/>
+        <w:jc w:val="center"/>
         <w:rPr>
           <w:rFonts w:asciiTheme="minorBidi" w:eastAsia="Arial Unicode MS" w:hAnsiTheme="minorBidi" w:cstheme="minorBidi"/>
           <w:b/>
@@ -3401,25 +3476,33 @@
       </w:pPr>
       <w:r>
         <w:rPr>
-          <w:rFonts w:asciiTheme="minorBidi" w:eastAsia="Arial Unicode MS" w:hAnsiTheme="minorBidi" w:cstheme="minorBidi"/>
-          <w:b/>
-          <w:bCs/>
-          <w:sz w:val="18"/>
-          <w:szCs w:val="18"/>
-          <w:lang w:val="pt-BR"/>
-        </w:rPr>
-        <w:t xml:space="preserve">ILICH ALEXANDER MERCEDES VALVERDE                                     </w:t>
-      </w:r>
-      <w:r>
-        <w:rPr>
-          <w:rFonts w:asciiTheme="minorBidi" w:hAnsiTheme="minorBidi" w:cstheme="minorBidi"/>
-          <w:b/>
-          <w:bCs/>
-          <w:sz w:val="18"/>
-          <w:szCs w:val="18"/>
-          <w:lang w:val="es-ES_tradnl"/>
-        </w:rPr>
-        <w:t>«TITULAR»</w:t>
+          <w:rFonts w:asciiTheme="minorBidi" w:hAnsiTheme="minorBidi" w:cstheme="minorBidi"/>
+          <w:b/>
+          <w:bCs/>
+          <w:sz w:val="18"/>
+          <w:szCs w:val="18"/>
+        </w:rPr>
+        <w:t>__________________________</w:t>
+      </w:r>
+      <w:r>
+        <w:rPr>
+          <w:rFonts w:asciiTheme="minorBidi" w:hAnsiTheme="minorBidi" w:cstheme="minorBidi"/>
+          <w:b/>
+          <w:bCs/>
+          <w:sz w:val="18"/>
+          <w:szCs w:val="18"/>
+        </w:rPr>
+        <w:t>_________</w:t>
+      </w:r>
+      <w:r>
+        <w:rPr>
+          <w:rFonts w:asciiTheme="minorBidi" w:hAnsiTheme="minorBidi" w:cstheme="minorBidi"/>
+          <w:b/>
+          <w:bCs/>
+          <w:sz w:val="18"/>
+          <w:szCs w:val="18"/>
+        </w:rPr>
+        <w:t>______</w:t>
       </w:r>
     </w:p>
     <w:p>
@@ -3428,8 +3511,8 @@
         <w:autoSpaceDE w:val="0"/>
         <w:autoSpaceDN w:val="0"/>
         <w:adjustRightInd w:val="0"/>
-        <w:spacing w:line="336" w:lineRule="auto"/>
-        <w:jc w:val="both"/>
+        <w:spacing w:line="324" w:lineRule="auto"/>
+        <w:jc w:val="center"/>
         <w:rPr>
           <w:rFonts w:asciiTheme="minorBidi" w:eastAsia="Arial Unicode MS" w:hAnsiTheme="minorBidi" w:cstheme="minorBidi"/>
           <w:b/>
@@ -3439,6 +3522,17 @@
           <w:lang w:val="pt-BR"/>
         </w:rPr>
       </w:pPr>
+      <w:r>
+        <w:rPr>
+          <w:rFonts w:asciiTheme="minorBidi" w:hAnsiTheme="minorBidi" w:cstheme="minorBidi"/>
+          <w:b/>
+          <w:bCs/>
+          <w:sz w:val="18"/>
+          <w:szCs w:val="18"/>
+          <w:lang w:val="es-ES_tradnl"/>
+        </w:rPr>
+        <w:t>«TITULAR»</w:t>
+      </w:r>
     </w:p>
     <w:p>
       <w:pPr>
@@ -3446,7 +3540,7 @@
         <w:autoSpaceDE w:val="0"/>
         <w:autoSpaceDN w:val="0"/>
         <w:adjustRightInd w:val="0"/>
-        <w:spacing w:line="336" w:lineRule="auto"/>
+        <w:spacing w:line="324" w:lineRule="auto"/>
         <w:jc w:val="both"/>
         <w:rPr>
           <w:rFonts w:asciiTheme="minorBidi" w:eastAsia="Arial Unicode MS" w:hAnsiTheme="minorBidi" w:cstheme="minorBidi"/>
@@ -3454,8 +3548,15 @@
           <w:bCs/>
           <w:sz w:val="18"/>
           <w:szCs w:val="18"/>
-          <w:lang w:val="es-PE"/>
-        </w:rPr>
+          <w:lang w:val="pt-BR"/>
+        </w:rPr>
+        <w:sectPr>
+          <w:type w:val="continuous"/>
+          <w:pgSz w:w="11906" w:h="16838"/>
+          <w:pgMar w:top="1440" w:right="1440" w:bottom="1440" w:left="1440" w:header="709" w:footer="709" w:gutter="0"/>
+          <w:cols w:num="2" w:space="708"/>
+          <w:docGrid w:linePitch="360"/>
+        </w:sectPr>
       </w:pPr>
     </w:p>
     <w:p>
@@ -3464,7 +3565,7 @@
         <w:autoSpaceDE w:val="0"/>
         <w:autoSpaceDN w:val="0"/>
         <w:adjustRightInd w:val="0"/>
-        <w:spacing w:line="336" w:lineRule="auto"/>
+        <w:spacing w:line="324" w:lineRule="auto"/>
         <w:jc w:val="both"/>
         <w:rPr>
           <w:rFonts w:asciiTheme="minorBidi" w:eastAsia="Arial Unicode MS" w:hAnsiTheme="minorBidi" w:cstheme="minorBidi"/>
@@ -3472,7 +3573,7 @@
           <w:bCs/>
           <w:sz w:val="18"/>
           <w:szCs w:val="18"/>
-          <w:lang w:val="es-PE"/>
+          <w:lang w:val="pt-BR"/>
         </w:rPr>
       </w:pPr>
     </w:p>
@@ -3482,25 +3583,7 @@
         <w:autoSpaceDE w:val="0"/>
         <w:autoSpaceDN w:val="0"/>
         <w:adjustRightInd w:val="0"/>
-        <w:spacing w:line="336" w:lineRule="auto"/>
-        <w:jc w:val="both"/>
-        <w:rPr>
-          <w:rFonts w:asciiTheme="minorBidi" w:eastAsia="Arial Unicode MS" w:hAnsiTheme="minorBidi" w:cstheme="minorBidi"/>
-          <w:b/>
-          <w:bCs/>
-          <w:sz w:val="18"/>
-          <w:szCs w:val="18"/>
-          <w:lang w:val="es-PE"/>
-        </w:rPr>
-      </w:pPr>
-    </w:p>
-    <w:p>
-      <w:pPr>
-        <w:widowControl w:val="0"/>
-        <w:autoSpaceDE w:val="0"/>
-        <w:autoSpaceDN w:val="0"/>
-        <w:adjustRightInd w:val="0"/>
-        <w:spacing w:line="336" w:lineRule="auto"/>
+        <w:spacing w:line="324" w:lineRule="auto"/>
         <w:jc w:val="both"/>
         <w:rPr>
           <w:rFonts w:asciiTheme="minorBidi" w:eastAsia="Arial Unicode MS" w:hAnsiTheme="minorBidi" w:cstheme="minorBidi"/>
@@ -3512,6 +3595,7 @@
       </w:pPr>
     </w:p>
     <w:sectPr>
+      <w:type w:val="continuous"/>
       <w:pgSz w:w="11906" w:h="16838"/>
       <w:pgMar w:top="1440" w:right="1440" w:bottom="1440" w:left="1440" w:header="709" w:footer="709" w:gutter="0"/>
       <w:cols w:space="708"/>

</xml_diff>